<commit_message>
docs: Enfasis en el proyecto y  elección de la estructura Cola (FIFO).
</commit_message>
<xml_diff>
--- a/Proyecto-Final.docx
+++ b/Proyecto-Final.docx
@@ -66,6 +66,13 @@
           <w:szCs w:val="28"/>
         </w:rPr>
       </w:pPr>
+      <w:r>
+        <w:rPr>
+          <w:sz w:val="28"/>
+          <w:szCs w:val="28"/>
+        </w:rPr>
+        <w:t>Para este segundo avance, buscamos información y redactamos la justificación de nuestro proyecto enfocándonos en cómo el sistema ayuda a resolver la desorganización en las filas de espera. También fundamentamos la elección de la estructura de datos tipo Cola (FIFO), ya que nos permite procesar los turnos en el orden exacto en que van llegando los usuarios, garantizando un servicio equitativo y un uso eficiente de la memoria.</w:t>
+      </w:r>
     </w:p>
     <w:sectPr>
       <w:pgSz w:w="12240" w:h="15840"/>

</xml_diff>

<commit_message>
docs: Avance en la planificacion del proyectol
</commit_message>
<xml_diff>
--- a/Proyecto-Final.docx
+++ b/Proyecto-Final.docx
@@ -73,6 +73,185 @@
         </w:rPr>
         <w:t>Para este segundo avance, buscamos información y redactamos la justificación de nuestro proyecto enfocándonos en cómo el sistema ayuda a resolver la desorganización en las filas de espera. También fundamentamos la elección de la estructura de datos tipo Cola (FIFO), ya que nos permite procesar los turnos en el orden exacto en que van llegando los usuarios, garantizando un servicio equitativo y un uso eficiente de la memoria.</w:t>
       </w:r>
+    </w:p>
+    <w:p>
+      <w:pPr>
+        <w:rPr>
+          <w:sz w:val="28"/>
+          <w:szCs w:val="28"/>
+        </w:rPr>
+      </w:pPr>
+      <w:r>
+        <w:rPr>
+          <w:sz w:val="28"/>
+          <w:szCs w:val="28"/>
+        </w:rPr>
+        <w:t>Además,</w:t>
+      </w:r>
+      <w:r>
+        <w:rPr>
+          <w:sz w:val="28"/>
+          <w:szCs w:val="28"/>
+        </w:rPr>
+        <w:t xml:space="preserve"> </w:t>
+      </w:r>
+      <w:r>
+        <w:rPr>
+          <w:sz w:val="28"/>
+          <w:szCs w:val="28"/>
+        </w:rPr>
+        <w:t>d</w:t>
+      </w:r>
+      <w:r>
+        <w:rPr>
+          <w:sz w:val="28"/>
+          <w:szCs w:val="28"/>
+        </w:rPr>
+        <w:t>urante esta semana avanzamos en la etapa inicial de planificación de nuestro sistema de gestión de turnos</w:t>
+      </w:r>
+      <w:r>
+        <w:rPr>
+          <w:sz w:val="28"/>
+          <w:szCs w:val="28"/>
+        </w:rPr>
+        <w:t xml:space="preserve"> </w:t>
+      </w:r>
+      <w:r>
+        <w:rPr>
+          <w:sz w:val="28"/>
+          <w:szCs w:val="28"/>
+        </w:rPr>
+        <w:t>a través</w:t>
+      </w:r>
+      <w:r>
+        <w:rPr>
+          <w:sz w:val="28"/>
+          <w:szCs w:val="28"/>
+        </w:rPr>
+        <w:t xml:space="preserve"> de una tarea que el profe</w:t>
+      </w:r>
+      <w:r>
+        <w:rPr>
+          <w:sz w:val="28"/>
+          <w:szCs w:val="28"/>
+        </w:rPr>
+        <w:t>sor</w:t>
+      </w:r>
+      <w:r>
+        <w:rPr>
+          <w:sz w:val="28"/>
+          <w:szCs w:val="28"/>
+        </w:rPr>
+        <w:t xml:space="preserve"> nos </w:t>
+      </w:r>
+      <w:r>
+        <w:rPr>
+          <w:sz w:val="28"/>
+          <w:szCs w:val="28"/>
+        </w:rPr>
+        <w:t>dejó</w:t>
+      </w:r>
+      <w:r>
+        <w:rPr>
+          <w:sz w:val="28"/>
+          <w:szCs w:val="28"/>
+        </w:rPr>
+        <w:t>.</w:t>
+      </w:r>
+      <w:r>
+        <w:rPr>
+          <w:sz w:val="28"/>
+          <w:szCs w:val="28"/>
+        </w:rPr>
+        <w:t xml:space="preserve"> Primero o</w:t>
+      </w:r>
+      <w:r>
+        <w:rPr>
+          <w:sz w:val="28"/>
+          <w:szCs w:val="28"/>
+        </w:rPr>
+        <w:t xml:space="preserve">rganizamos el trabajo en 10 </w:t>
+      </w:r>
+      <w:proofErr w:type="spellStart"/>
+      <w:r>
+        <w:rPr>
+          <w:sz w:val="28"/>
+          <w:szCs w:val="28"/>
+        </w:rPr>
+        <w:t>S</w:t>
+      </w:r>
+      <w:r>
+        <w:rPr>
+          <w:sz w:val="28"/>
+          <w:szCs w:val="28"/>
+        </w:rPr>
+        <w:t>prints</w:t>
+      </w:r>
+      <w:proofErr w:type="spellEnd"/>
+      <w:r>
+        <w:rPr>
+          <w:sz w:val="28"/>
+          <w:szCs w:val="28"/>
+        </w:rPr>
+        <w:t xml:space="preserve"> semanales para llevar un control ordenado del desarrollo del </w:t>
+      </w:r>
+      <w:r>
+        <w:rPr>
+          <w:sz w:val="28"/>
+          <w:szCs w:val="28"/>
+        </w:rPr>
+        <w:t>software</w:t>
+      </w:r>
+      <w:r>
+        <w:rPr>
+          <w:sz w:val="28"/>
+          <w:szCs w:val="28"/>
+        </w:rPr>
+        <w:t>, después</w:t>
+      </w:r>
+      <w:r>
+        <w:rPr>
+          <w:sz w:val="28"/>
+          <w:szCs w:val="28"/>
+        </w:rPr>
+        <w:t xml:space="preserve"> d</w:t>
+      </w:r>
+      <w:r>
+        <w:rPr>
+          <w:sz w:val="28"/>
+          <w:szCs w:val="28"/>
+        </w:rPr>
+        <w:t>efinimos</w:t>
+      </w:r>
+      <w:r>
+        <w:rPr>
+          <w:sz w:val="28"/>
+          <w:szCs w:val="28"/>
+        </w:rPr>
+        <w:t xml:space="preserve"> los </w:t>
+      </w:r>
+      <w:r>
+        <w:rPr>
+          <w:sz w:val="28"/>
+          <w:szCs w:val="28"/>
+        </w:rPr>
+        <w:t>objetivos generales</w:t>
+      </w:r>
+      <w:r>
+        <w:rPr>
+          <w:sz w:val="28"/>
+          <w:szCs w:val="28"/>
+        </w:rPr>
+        <w:t xml:space="preserve"> y específicos para tener claro el alcance del proyecto, y realizamos la matriz FODA para identificar nuestras fortalezas y posibles riesgos.</w:t>
+      </w:r>
+    </w:p>
+    <w:p>
+      <w:pPr>
+        <w:rPr>
+          <w:sz w:val="28"/>
+          <w:szCs w:val="28"/>
+        </w:rPr>
+      </w:pPr>
     </w:p>
     <w:sectPr>
       <w:pgSz w:w="12240" w:h="15840"/>

</xml_diff>

<commit_message>
docs: Avance en el sprint de la semana 1
</commit_message>
<xml_diff>
--- a/Proyecto-Final.docx
+++ b/Proyecto-Final.docx
@@ -243,6 +243,588 @@
           <w:szCs w:val="28"/>
         </w:rPr>
         <w:t xml:space="preserve"> y específicos para tener claro el alcance del proyecto, y realizamos la matriz FODA para identificar nuestras fortalezas y posibles riesgos.</w:t>
+      </w:r>
+    </w:p>
+    <w:p>
+      <w:pPr>
+        <w:rPr>
+          <w:sz w:val="28"/>
+          <w:szCs w:val="28"/>
+        </w:rPr>
+      </w:pPr>
+      <w:r>
+        <w:rPr>
+          <w:sz w:val="28"/>
+          <w:szCs w:val="28"/>
+        </w:rPr>
+        <w:br w:type="page"/>
+      </w:r>
+    </w:p>
+    <w:p>
+      <w:pPr>
+        <w:rPr>
+          <w:sz w:val="28"/>
+          <w:szCs w:val="28"/>
+        </w:rPr>
+      </w:pPr>
+      <w:r>
+        <w:rPr>
+          <w:sz w:val="28"/>
+          <w:szCs w:val="28"/>
+        </w:rPr>
+        <w:lastRenderedPageBreak/>
+        <w:t xml:space="preserve">Estructura de datos </w:t>
+      </w:r>
+    </w:p>
+    <w:p>
+      <w:pPr>
+        <w:rPr>
+          <w:sz w:val="28"/>
+          <w:szCs w:val="28"/>
+        </w:rPr>
+      </w:pPr>
+      <w:r>
+        <w:rPr>
+          <w:sz w:val="28"/>
+          <w:szCs w:val="28"/>
+        </w:rPr>
+        <w:t xml:space="preserve">La semana pasada iniciamos el primer sprint, cuyo objetivo principal era declarar y tomar en cuenta las variables para el </w:t>
+      </w:r>
+      <w:r>
+        <w:rPr>
+          <w:b/>
+          <w:bCs/>
+          <w:sz w:val="28"/>
+          <w:szCs w:val="28"/>
+        </w:rPr>
+        <w:t>Sistema de Gestión y Control de Turnos</w:t>
+      </w:r>
+      <w:r>
+        <w:rPr>
+          <w:sz w:val="28"/>
+          <w:szCs w:val="28"/>
+        </w:rPr>
+        <w:t xml:space="preserve">. Según lo establecido, la meta consistía en diseñar la estructura lógica del sistema y definir los datos relacionados con los turnos. Como </w:t>
+      </w:r>
+      <w:r>
+        <w:rPr>
+          <w:b/>
+          <w:bCs/>
+          <w:sz w:val="28"/>
+          <w:szCs w:val="28"/>
+        </w:rPr>
+        <w:t>mínimo producto viable</w:t>
+      </w:r>
+      <w:r>
+        <w:rPr>
+          <w:sz w:val="28"/>
+          <w:szCs w:val="28"/>
+        </w:rPr>
+        <w:t>, se planteó elaborar el diagrama de flujo del sistema y definir la clase en pseudocódigo.</w:t>
+      </w:r>
+    </w:p>
+    <w:p>
+      <w:pPr>
+        <w:rPr>
+          <w:sz w:val="28"/>
+          <w:szCs w:val="28"/>
+        </w:rPr>
+      </w:pPr>
+      <w:r>
+        <w:rPr>
+          <w:sz w:val="28"/>
+          <w:szCs w:val="28"/>
+        </w:rPr>
+        <w:t>Con esto en mente, comenzamos a definir las variables. Por ejemplo:</w:t>
+      </w:r>
+    </w:p>
+    <w:p>
+      <w:pPr>
+        <w:numPr>
+          <w:ilvl w:val="0"/>
+          <w:numId w:val="1"/>
+        </w:numPr>
+        <w:rPr>
+          <w:sz w:val="28"/>
+          <w:szCs w:val="28"/>
+        </w:rPr>
+      </w:pPr>
+      <w:proofErr w:type="spellStart"/>
+      <w:proofErr w:type="gramStart"/>
+      <w:r>
+        <w:rPr>
+          <w:b/>
+          <w:bCs/>
+          <w:sz w:val="28"/>
+          <w:szCs w:val="28"/>
+        </w:rPr>
+        <w:t>id.turno</w:t>
+      </w:r>
+      <w:proofErr w:type="spellEnd"/>
+      <w:proofErr w:type="gramEnd"/>
+      <w:r>
+        <w:rPr>
+          <w:sz w:val="28"/>
+          <w:szCs w:val="28"/>
+        </w:rPr>
+        <w:t xml:space="preserve"> → variable entera.</w:t>
+      </w:r>
+    </w:p>
+    <w:p>
+      <w:pPr>
+        <w:numPr>
+          <w:ilvl w:val="0"/>
+          <w:numId w:val="1"/>
+        </w:numPr>
+        <w:rPr>
+          <w:sz w:val="28"/>
+          <w:szCs w:val="28"/>
+        </w:rPr>
+      </w:pPr>
+      <w:proofErr w:type="spellStart"/>
+      <w:proofErr w:type="gramStart"/>
+      <w:r>
+        <w:rPr>
+          <w:b/>
+          <w:bCs/>
+          <w:sz w:val="28"/>
+          <w:szCs w:val="28"/>
+        </w:rPr>
+        <w:t>nombre.cliente</w:t>
+      </w:r>
+      <w:proofErr w:type="spellEnd"/>
+      <w:proofErr w:type="gramEnd"/>
+      <w:r>
+        <w:rPr>
+          <w:sz w:val="28"/>
+          <w:szCs w:val="28"/>
+        </w:rPr>
+        <w:t xml:space="preserve"> → variable de texto.</w:t>
+      </w:r>
+    </w:p>
+    <w:p>
+      <w:pPr>
+        <w:numPr>
+          <w:ilvl w:val="0"/>
+          <w:numId w:val="1"/>
+        </w:numPr>
+        <w:rPr>
+          <w:sz w:val="28"/>
+          <w:szCs w:val="28"/>
+        </w:rPr>
+      </w:pPr>
+      <w:proofErr w:type="spellStart"/>
+      <w:proofErr w:type="gramStart"/>
+      <w:r>
+        <w:rPr>
+          <w:b/>
+          <w:bCs/>
+          <w:sz w:val="28"/>
+          <w:szCs w:val="28"/>
+        </w:rPr>
+        <w:t>tipo.trámite</w:t>
+      </w:r>
+      <w:proofErr w:type="spellEnd"/>
+      <w:proofErr w:type="gramEnd"/>
+      <w:r>
+        <w:rPr>
+          <w:sz w:val="28"/>
+          <w:szCs w:val="28"/>
+        </w:rPr>
+        <w:t xml:space="preserve"> → variable de texto.</w:t>
+      </w:r>
+    </w:p>
+    <w:p>
+      <w:pPr>
+        <w:numPr>
+          <w:ilvl w:val="0"/>
+          <w:numId w:val="1"/>
+        </w:numPr>
+        <w:rPr>
+          <w:sz w:val="28"/>
+          <w:szCs w:val="28"/>
+        </w:rPr>
+      </w:pPr>
+      <w:r>
+        <w:rPr>
+          <w:b/>
+          <w:bCs/>
+          <w:sz w:val="28"/>
+          <w:szCs w:val="28"/>
+        </w:rPr>
+        <w:t>estado</w:t>
+      </w:r>
+      <w:r>
+        <w:rPr>
+          <w:sz w:val="28"/>
+          <w:szCs w:val="28"/>
+        </w:rPr>
+        <w:t xml:space="preserve"> → variable de texto, con valores </w:t>
+      </w:r>
+      <w:r>
+        <w:rPr>
+          <w:i/>
+          <w:iCs/>
+          <w:sz w:val="28"/>
+          <w:szCs w:val="28"/>
+        </w:rPr>
+        <w:t>“en espera”</w:t>
+      </w:r>
+      <w:r>
+        <w:rPr>
+          <w:sz w:val="28"/>
+          <w:szCs w:val="28"/>
+        </w:rPr>
+        <w:t xml:space="preserve"> o </w:t>
+      </w:r>
+      <w:r>
+        <w:rPr>
+          <w:i/>
+          <w:iCs/>
+          <w:sz w:val="28"/>
+          <w:szCs w:val="28"/>
+        </w:rPr>
+        <w:t>“atendiendo”</w:t>
+      </w:r>
+      <w:r>
+        <w:rPr>
+          <w:sz w:val="28"/>
+          <w:szCs w:val="28"/>
+        </w:rPr>
+        <w:t>.</w:t>
+      </w:r>
+    </w:p>
+    <w:p>
+      <w:pPr>
+        <w:rPr>
+          <w:sz w:val="28"/>
+          <w:szCs w:val="28"/>
+        </w:rPr>
+      </w:pPr>
+      <w:r>
+        <w:rPr>
+          <w:sz w:val="28"/>
+          <w:szCs w:val="28"/>
+        </w:rPr>
+        <w:t>Posteriormente, pasamos al diseño del diagrama de flujo, donde se incluyeron las siguientes inicializaciones:</w:t>
+      </w:r>
+    </w:p>
+    <w:p>
+      <w:pPr>
+        <w:numPr>
+          <w:ilvl w:val="0"/>
+          <w:numId w:val="2"/>
+        </w:numPr>
+        <w:rPr>
+          <w:sz w:val="28"/>
+          <w:szCs w:val="28"/>
+        </w:rPr>
+      </w:pPr>
+      <w:r>
+        <w:rPr>
+          <w:b/>
+          <w:bCs/>
+          <w:sz w:val="28"/>
+          <w:szCs w:val="28"/>
+        </w:rPr>
+        <w:t>cola = []</w:t>
+      </w:r>
+      <w:r>
+        <w:rPr>
+          <w:sz w:val="28"/>
+          <w:szCs w:val="28"/>
+        </w:rPr>
+        <w:t xml:space="preserve"> → lista donde se almacenarán los clientes.</w:t>
+      </w:r>
+    </w:p>
+    <w:p>
+      <w:pPr>
+        <w:numPr>
+          <w:ilvl w:val="0"/>
+          <w:numId w:val="2"/>
+        </w:numPr>
+        <w:rPr>
+          <w:sz w:val="28"/>
+          <w:szCs w:val="28"/>
+        </w:rPr>
+      </w:pPr>
+      <w:proofErr w:type="spellStart"/>
+      <w:proofErr w:type="gramStart"/>
+      <w:r>
+        <w:rPr>
+          <w:b/>
+          <w:bCs/>
+          <w:sz w:val="28"/>
+          <w:szCs w:val="28"/>
+        </w:rPr>
+        <w:t>contador.turnos</w:t>
+      </w:r>
+      <w:proofErr w:type="spellEnd"/>
+      <w:proofErr w:type="gramEnd"/>
+      <w:r>
+        <w:rPr>
+          <w:b/>
+          <w:bCs/>
+          <w:sz w:val="28"/>
+          <w:szCs w:val="28"/>
+        </w:rPr>
+        <w:t xml:space="preserve"> = 0</w:t>
+      </w:r>
+      <w:r>
+        <w:rPr>
+          <w:sz w:val="28"/>
+          <w:szCs w:val="28"/>
+        </w:rPr>
+        <w:t xml:space="preserve"> → registro de la cantidad de clientes.</w:t>
+      </w:r>
+    </w:p>
+    <w:p>
+      <w:pPr>
+        <w:numPr>
+          <w:ilvl w:val="0"/>
+          <w:numId w:val="2"/>
+        </w:numPr>
+        <w:rPr>
+          <w:sz w:val="28"/>
+          <w:szCs w:val="28"/>
+        </w:rPr>
+      </w:pPr>
+      <w:proofErr w:type="spellStart"/>
+      <w:proofErr w:type="gramStart"/>
+      <w:r>
+        <w:rPr>
+          <w:b/>
+          <w:bCs/>
+          <w:sz w:val="28"/>
+          <w:szCs w:val="28"/>
+        </w:rPr>
+        <w:t>capacidad.máxima</w:t>
+      </w:r>
+      <w:proofErr w:type="spellEnd"/>
+      <w:proofErr w:type="gramEnd"/>
+      <w:r>
+        <w:rPr>
+          <w:b/>
+          <w:bCs/>
+          <w:sz w:val="28"/>
+          <w:szCs w:val="28"/>
+        </w:rPr>
+        <w:t xml:space="preserve"> = 10</w:t>
+      </w:r>
+      <w:r>
+        <w:rPr>
+          <w:sz w:val="28"/>
+          <w:szCs w:val="28"/>
+        </w:rPr>
+        <w:t xml:space="preserve"> → límite de personas en la fila.</w:t>
+      </w:r>
+    </w:p>
+    <w:p>
+      <w:pPr>
+        <w:numPr>
+          <w:ilvl w:val="0"/>
+          <w:numId w:val="2"/>
+        </w:numPr>
+        <w:rPr>
+          <w:sz w:val="28"/>
+          <w:szCs w:val="28"/>
+        </w:rPr>
+      </w:pPr>
+      <w:proofErr w:type="spellStart"/>
+      <w:r>
+        <w:rPr>
+          <w:b/>
+          <w:bCs/>
+          <w:sz w:val="28"/>
+          <w:szCs w:val="28"/>
+        </w:rPr>
+        <w:t>opc</w:t>
+      </w:r>
+      <w:proofErr w:type="spellEnd"/>
+      <w:r>
+        <w:rPr>
+          <w:sz w:val="28"/>
+          <w:szCs w:val="28"/>
+        </w:rPr>
+        <w:t xml:space="preserve"> → variable para guardar las opciones seleccionadas.</w:t>
+      </w:r>
+    </w:p>
+    <w:p>
+      <w:pPr>
+        <w:rPr>
+          <w:sz w:val="28"/>
+          <w:szCs w:val="28"/>
+        </w:rPr>
+      </w:pPr>
+      <w:r>
+        <w:rPr>
+          <w:sz w:val="28"/>
+          <w:szCs w:val="28"/>
+        </w:rPr>
+        <w:t xml:space="preserve">El diagrama de flujo contempla </w:t>
+      </w:r>
+      <w:r>
+        <w:rPr>
+          <w:b/>
+          <w:bCs/>
+          <w:sz w:val="28"/>
+          <w:szCs w:val="28"/>
+        </w:rPr>
+        <w:t>cuatro opciones principales</w:t>
+      </w:r>
+      <w:r>
+        <w:rPr>
+          <w:sz w:val="28"/>
+          <w:szCs w:val="28"/>
+        </w:rPr>
+        <w:t>:</w:t>
+      </w:r>
+    </w:p>
+    <w:p>
+      <w:pPr>
+        <w:numPr>
+          <w:ilvl w:val="0"/>
+          <w:numId w:val="3"/>
+        </w:numPr>
+        <w:rPr>
+          <w:sz w:val="28"/>
+          <w:szCs w:val="28"/>
+        </w:rPr>
+      </w:pPr>
+      <w:r>
+        <w:rPr>
+          <w:b/>
+          <w:bCs/>
+          <w:sz w:val="28"/>
+          <w:szCs w:val="28"/>
+        </w:rPr>
+        <w:t>Tomar turno</w:t>
+      </w:r>
+      <w:r>
+        <w:rPr>
+          <w:sz w:val="28"/>
+          <w:szCs w:val="28"/>
+        </w:rPr>
+        <w:t>.</w:t>
+      </w:r>
+    </w:p>
+    <w:p>
+      <w:pPr>
+        <w:numPr>
+          <w:ilvl w:val="0"/>
+          <w:numId w:val="3"/>
+        </w:numPr>
+        <w:rPr>
+          <w:sz w:val="28"/>
+          <w:szCs w:val="28"/>
+        </w:rPr>
+      </w:pPr>
+      <w:r>
+        <w:rPr>
+          <w:b/>
+          <w:bCs/>
+          <w:sz w:val="28"/>
+          <w:szCs w:val="28"/>
+        </w:rPr>
+        <w:t>Tiempo en espera</w:t>
+      </w:r>
+      <w:r>
+        <w:rPr>
+          <w:sz w:val="28"/>
+          <w:szCs w:val="28"/>
+        </w:rPr>
+        <w:t>.</w:t>
+      </w:r>
+    </w:p>
+    <w:p>
+      <w:pPr>
+        <w:numPr>
+          <w:ilvl w:val="0"/>
+          <w:numId w:val="3"/>
+        </w:numPr>
+        <w:rPr>
+          <w:sz w:val="28"/>
+          <w:szCs w:val="28"/>
+        </w:rPr>
+      </w:pPr>
+      <w:r>
+        <w:rPr>
+          <w:b/>
+          <w:bCs/>
+          <w:sz w:val="28"/>
+          <w:szCs w:val="28"/>
+        </w:rPr>
+        <w:t>Atendiendo el turno</w:t>
+      </w:r>
+      <w:r>
+        <w:rPr>
+          <w:sz w:val="28"/>
+          <w:szCs w:val="28"/>
+        </w:rPr>
+        <w:t>.</w:t>
+      </w:r>
+    </w:p>
+    <w:p>
+      <w:pPr>
+        <w:numPr>
+          <w:ilvl w:val="0"/>
+          <w:numId w:val="3"/>
+        </w:numPr>
+        <w:rPr>
+          <w:sz w:val="28"/>
+          <w:szCs w:val="28"/>
+        </w:rPr>
+      </w:pPr>
+      <w:r>
+        <w:rPr>
+          <w:b/>
+          <w:bCs/>
+          <w:sz w:val="28"/>
+          <w:szCs w:val="28"/>
+        </w:rPr>
+        <w:t>Atendido</w:t>
+      </w:r>
+      <w:r>
+        <w:rPr>
+          <w:sz w:val="28"/>
+          <w:szCs w:val="28"/>
+        </w:rPr>
+        <w:t>-</w:t>
+      </w:r>
+      <w:r>
+        <w:rPr>
+          <w:sz w:val="28"/>
+          <w:szCs w:val="28"/>
+        </w:rPr>
+        <w:t xml:space="preserve">siguiente. </w:t>
+      </w:r>
+    </w:p>
+    <w:p>
+      <w:pPr>
+        <w:numPr>
+          <w:ilvl w:val="0"/>
+          <w:numId w:val="3"/>
+        </w:numPr>
+        <w:rPr>
+          <w:sz w:val="28"/>
+          <w:szCs w:val="28"/>
+        </w:rPr>
+      </w:pPr>
+      <w:r>
+        <w:rPr>
+          <w:b/>
+          <w:bCs/>
+          <w:sz w:val="28"/>
+          <w:szCs w:val="28"/>
+        </w:rPr>
+        <w:t>Finalizar el turno</w:t>
+      </w:r>
+      <w:r>
+        <w:rPr>
+          <w:sz w:val="28"/>
+          <w:szCs w:val="28"/>
+        </w:rPr>
+        <w:t xml:space="preserve"> (cuando el cliente ya ha sido atendido).</w:t>
       </w:r>
     </w:p>
     <w:p>
@@ -261,6 +843,431 @@
     </w:sectPr>
   </w:body>
 </w:document>
+</file>
+
+<file path=word/numbering.xml><?xml version="1.0" encoding="utf-8"?>
+<w:numbering xmlns:wpc="http://schemas.microsoft.com/office/word/2010/wordprocessingCanvas" xmlns:cx="http://schemas.microsoft.com/office/drawing/2014/chartex" xmlns:cx1="http://schemas.microsoft.com/office/drawing/2015/9/8/chartex" xmlns:cx2="http://schemas.microsoft.com/office/drawing/2015/10/21/chartex" xmlns:cx3="http://schemas.microsoft.com/office/drawing/2016/5/9/chartex" xmlns:cx4="http://schemas.microsoft.com/office/drawing/2016/5/10/chartex" xmlns:cx5="http://schemas.microsoft.com/office/drawing/2016/5/11/chartex" xmlns:cx6="http://schemas.microsoft.com/office/drawing/2016/5/12/chartex" xmlns:cx7="http://schemas.microsoft.com/office/drawing/2016/5/13/chartex" xmlns:cx8="http://schemas.microsoft.com/office/drawing/2016/5/14/chartex" xmlns:mc="http://schemas.openxmlformats.org/markup-compatibility/2006" xmlns:aink="http://schemas.microsoft.com/office/drawing/2016/ink" xmlns:am3d="http://schemas.microsoft.com/office/drawing/2017/model3d" xmlns:o="urn:schemas-microsoft-com:office:office" xmlns:oel="http://schemas.microsoft.com/office/2019/extlst" xmlns:r="http://schemas.openxmlformats.org/officeDocument/2006/relationships" xmlns:m="http://schemas.openxmlformats.org/officeDocument/2006/math" xmlns:v="urn:schemas-microsoft-com:vml" xmlns:wp14="http://schemas.microsoft.com/office/word/2010/wordprocessingDrawing" xmlns:wp="http://schemas.openxmlformats.org/drawingml/2006/wordprocessingDrawing" xmlns:w10="urn:schemas-microsoft-com:office:word" xmlns:w="http://schemas.openxmlformats.org/wordprocessingml/2006/main" xmlns:w14="http://schemas.microsoft.com/office/word/2010/wordml" xmlns:w15="http://schemas.microsoft.com/office/word/2012/wordml" xmlns:w16cex="http://schemas.microsoft.com/office/word/2018/wordml/cex" xmlns:w16cid="http://schemas.microsoft.com/office/word/2016/wordml/cid" xmlns:w16="http://schemas.microsoft.com/office/word/2018/wordml" xmlns:w16du="http://schemas.microsoft.com/office/word/2023/wordml/word16du" xmlns:w16sdtdh="http://schemas.microsoft.com/office/word/2020/wordml/sdtdatahash" xmlns:w16sdtfl="http://schemas.microsoft.com/office/word/2024/wordml/sdtformatlock" xmlns:w16se="http://schemas.microsoft.com/office/word/2015/wordml/symex" xmlns:wpg="http://schemas.microsoft.com/office/word/2010/wordprocessingGroup" xmlns:wpi="http://schemas.microsoft.com/office/word/2010/wordprocessingInk" xmlns:wne="http://schemas.microsoft.com/office/word/2006/wordml" xmlns:wps="http://schemas.microsoft.com/office/word/2010/wordprocessingShape" mc:Ignorable="w14 w15 w16se w16cid w16 w16cex w16sdtdh w16sdtfl w16du wp14">
+  <w:abstractNum w:abstractNumId="0" w15:restartNumberingAfterBreak="0">
+    <w:nsid w:val="2C725FAB"/>
+    <w:multiLevelType w:val="multilevel"/>
+    <w:tmpl w:val="F692FCAA"/>
+    <w:lvl w:ilvl="0">
+      <w:start w:val="1"/>
+      <w:numFmt w:val="decimal"/>
+      <w:lvlText w:val="%1."/>
+      <w:lvlJc w:val="left"/>
+      <w:pPr>
+        <w:tabs>
+          <w:tab w:val="num" w:pos="720"/>
+        </w:tabs>
+        <w:ind w:left="720" w:hanging="360"/>
+      </w:pPr>
+    </w:lvl>
+    <w:lvl w:ilvl="1" w:tentative="1">
+      <w:start w:val="1"/>
+      <w:numFmt w:val="decimal"/>
+      <w:lvlText w:val="%2."/>
+      <w:lvlJc w:val="left"/>
+      <w:pPr>
+        <w:tabs>
+          <w:tab w:val="num" w:pos="1440"/>
+        </w:tabs>
+        <w:ind w:left="1440" w:hanging="360"/>
+      </w:pPr>
+    </w:lvl>
+    <w:lvl w:ilvl="2" w:tentative="1">
+      <w:start w:val="1"/>
+      <w:numFmt w:val="decimal"/>
+      <w:lvlText w:val="%3."/>
+      <w:lvlJc w:val="left"/>
+      <w:pPr>
+        <w:tabs>
+          <w:tab w:val="num" w:pos="2160"/>
+        </w:tabs>
+        <w:ind w:left="2160" w:hanging="360"/>
+      </w:pPr>
+    </w:lvl>
+    <w:lvl w:ilvl="3" w:tentative="1">
+      <w:start w:val="1"/>
+      <w:numFmt w:val="decimal"/>
+      <w:lvlText w:val="%4."/>
+      <w:lvlJc w:val="left"/>
+      <w:pPr>
+        <w:tabs>
+          <w:tab w:val="num" w:pos="2880"/>
+        </w:tabs>
+        <w:ind w:left="2880" w:hanging="360"/>
+      </w:pPr>
+    </w:lvl>
+    <w:lvl w:ilvl="4" w:tentative="1">
+      <w:start w:val="1"/>
+      <w:numFmt w:val="decimal"/>
+      <w:lvlText w:val="%5."/>
+      <w:lvlJc w:val="left"/>
+      <w:pPr>
+        <w:tabs>
+          <w:tab w:val="num" w:pos="3600"/>
+        </w:tabs>
+        <w:ind w:left="3600" w:hanging="360"/>
+      </w:pPr>
+    </w:lvl>
+    <w:lvl w:ilvl="5" w:tentative="1">
+      <w:start w:val="1"/>
+      <w:numFmt w:val="decimal"/>
+      <w:lvlText w:val="%6."/>
+      <w:lvlJc w:val="left"/>
+      <w:pPr>
+        <w:tabs>
+          <w:tab w:val="num" w:pos="4320"/>
+        </w:tabs>
+        <w:ind w:left="4320" w:hanging="360"/>
+      </w:pPr>
+    </w:lvl>
+    <w:lvl w:ilvl="6" w:tentative="1">
+      <w:start w:val="1"/>
+      <w:numFmt w:val="decimal"/>
+      <w:lvlText w:val="%7."/>
+      <w:lvlJc w:val="left"/>
+      <w:pPr>
+        <w:tabs>
+          <w:tab w:val="num" w:pos="5040"/>
+        </w:tabs>
+        <w:ind w:left="5040" w:hanging="360"/>
+      </w:pPr>
+    </w:lvl>
+    <w:lvl w:ilvl="7" w:tentative="1">
+      <w:start w:val="1"/>
+      <w:numFmt w:val="decimal"/>
+      <w:lvlText w:val="%8."/>
+      <w:lvlJc w:val="left"/>
+      <w:pPr>
+        <w:tabs>
+          <w:tab w:val="num" w:pos="5760"/>
+        </w:tabs>
+        <w:ind w:left="5760" w:hanging="360"/>
+      </w:pPr>
+    </w:lvl>
+    <w:lvl w:ilvl="8" w:tentative="1">
+      <w:start w:val="1"/>
+      <w:numFmt w:val="decimal"/>
+      <w:lvlText w:val="%9."/>
+      <w:lvlJc w:val="left"/>
+      <w:pPr>
+        <w:tabs>
+          <w:tab w:val="num" w:pos="6480"/>
+        </w:tabs>
+        <w:ind w:left="6480" w:hanging="360"/>
+      </w:pPr>
+    </w:lvl>
+  </w:abstractNum>
+  <w:abstractNum w:abstractNumId="1" w15:restartNumberingAfterBreak="0">
+    <w:nsid w:val="44BB0C41"/>
+    <w:multiLevelType w:val="multilevel"/>
+    <w:tmpl w:val="7E144B04"/>
+    <w:lvl w:ilvl="0">
+      <w:start w:val="1"/>
+      <w:numFmt w:val="bullet"/>
+      <w:lvlText w:val=""/>
+      <w:lvlJc w:val="left"/>
+      <w:pPr>
+        <w:tabs>
+          <w:tab w:val="num" w:pos="720"/>
+        </w:tabs>
+        <w:ind w:left="720" w:hanging="360"/>
+      </w:pPr>
+      <w:rPr>
+        <w:rFonts w:ascii="Symbol" w:hAnsi="Symbol" w:hint="default"/>
+        <w:sz w:val="20"/>
+      </w:rPr>
+    </w:lvl>
+    <w:lvl w:ilvl="1" w:tentative="1">
+      <w:start w:val="1"/>
+      <w:numFmt w:val="bullet"/>
+      <w:lvlText w:val="o"/>
+      <w:lvlJc w:val="left"/>
+      <w:pPr>
+        <w:tabs>
+          <w:tab w:val="num" w:pos="1440"/>
+        </w:tabs>
+        <w:ind w:left="1440" w:hanging="360"/>
+      </w:pPr>
+      <w:rPr>
+        <w:rFonts w:ascii="Courier New" w:hAnsi="Courier New" w:hint="default"/>
+        <w:sz w:val="20"/>
+      </w:rPr>
+    </w:lvl>
+    <w:lvl w:ilvl="2" w:tentative="1">
+      <w:start w:val="1"/>
+      <w:numFmt w:val="bullet"/>
+      <w:lvlText w:val=""/>
+      <w:lvlJc w:val="left"/>
+      <w:pPr>
+        <w:tabs>
+          <w:tab w:val="num" w:pos="2160"/>
+        </w:tabs>
+        <w:ind w:left="2160" w:hanging="360"/>
+      </w:pPr>
+      <w:rPr>
+        <w:rFonts w:ascii="Wingdings" w:hAnsi="Wingdings" w:hint="default"/>
+        <w:sz w:val="20"/>
+      </w:rPr>
+    </w:lvl>
+    <w:lvl w:ilvl="3" w:tentative="1">
+      <w:start w:val="1"/>
+      <w:numFmt w:val="bullet"/>
+      <w:lvlText w:val=""/>
+      <w:lvlJc w:val="left"/>
+      <w:pPr>
+        <w:tabs>
+          <w:tab w:val="num" w:pos="2880"/>
+        </w:tabs>
+        <w:ind w:left="2880" w:hanging="360"/>
+      </w:pPr>
+      <w:rPr>
+        <w:rFonts w:ascii="Wingdings" w:hAnsi="Wingdings" w:hint="default"/>
+        <w:sz w:val="20"/>
+      </w:rPr>
+    </w:lvl>
+    <w:lvl w:ilvl="4" w:tentative="1">
+      <w:start w:val="1"/>
+      <w:numFmt w:val="bullet"/>
+      <w:lvlText w:val=""/>
+      <w:lvlJc w:val="left"/>
+      <w:pPr>
+        <w:tabs>
+          <w:tab w:val="num" w:pos="3600"/>
+        </w:tabs>
+        <w:ind w:left="3600" w:hanging="360"/>
+      </w:pPr>
+      <w:rPr>
+        <w:rFonts w:ascii="Wingdings" w:hAnsi="Wingdings" w:hint="default"/>
+        <w:sz w:val="20"/>
+      </w:rPr>
+    </w:lvl>
+    <w:lvl w:ilvl="5" w:tentative="1">
+      <w:start w:val="1"/>
+      <w:numFmt w:val="bullet"/>
+      <w:lvlText w:val=""/>
+      <w:lvlJc w:val="left"/>
+      <w:pPr>
+        <w:tabs>
+          <w:tab w:val="num" w:pos="4320"/>
+        </w:tabs>
+        <w:ind w:left="4320" w:hanging="360"/>
+      </w:pPr>
+      <w:rPr>
+        <w:rFonts w:ascii="Wingdings" w:hAnsi="Wingdings" w:hint="default"/>
+        <w:sz w:val="20"/>
+      </w:rPr>
+    </w:lvl>
+    <w:lvl w:ilvl="6" w:tentative="1">
+      <w:start w:val="1"/>
+      <w:numFmt w:val="bullet"/>
+      <w:lvlText w:val=""/>
+      <w:lvlJc w:val="left"/>
+      <w:pPr>
+        <w:tabs>
+          <w:tab w:val="num" w:pos="5040"/>
+        </w:tabs>
+        <w:ind w:left="5040" w:hanging="360"/>
+      </w:pPr>
+      <w:rPr>
+        <w:rFonts w:ascii="Wingdings" w:hAnsi="Wingdings" w:hint="default"/>
+        <w:sz w:val="20"/>
+      </w:rPr>
+    </w:lvl>
+    <w:lvl w:ilvl="7" w:tentative="1">
+      <w:start w:val="1"/>
+      <w:numFmt w:val="bullet"/>
+      <w:lvlText w:val=""/>
+      <w:lvlJc w:val="left"/>
+      <w:pPr>
+        <w:tabs>
+          <w:tab w:val="num" w:pos="5760"/>
+        </w:tabs>
+        <w:ind w:left="5760" w:hanging="360"/>
+      </w:pPr>
+      <w:rPr>
+        <w:rFonts w:ascii="Wingdings" w:hAnsi="Wingdings" w:hint="default"/>
+        <w:sz w:val="20"/>
+      </w:rPr>
+    </w:lvl>
+    <w:lvl w:ilvl="8" w:tentative="1">
+      <w:start w:val="1"/>
+      <w:numFmt w:val="bullet"/>
+      <w:lvlText w:val=""/>
+      <w:lvlJc w:val="left"/>
+      <w:pPr>
+        <w:tabs>
+          <w:tab w:val="num" w:pos="6480"/>
+        </w:tabs>
+        <w:ind w:left="6480" w:hanging="360"/>
+      </w:pPr>
+      <w:rPr>
+        <w:rFonts w:ascii="Wingdings" w:hAnsi="Wingdings" w:hint="default"/>
+        <w:sz w:val="20"/>
+      </w:rPr>
+    </w:lvl>
+  </w:abstractNum>
+  <w:abstractNum w:abstractNumId="2" w15:restartNumberingAfterBreak="0">
+    <w:nsid w:val="49674A8C"/>
+    <w:multiLevelType w:val="multilevel"/>
+    <w:tmpl w:val="357419EE"/>
+    <w:lvl w:ilvl="0">
+      <w:start w:val="1"/>
+      <w:numFmt w:val="bullet"/>
+      <w:lvlText w:val=""/>
+      <w:lvlJc w:val="left"/>
+      <w:pPr>
+        <w:tabs>
+          <w:tab w:val="num" w:pos="720"/>
+        </w:tabs>
+        <w:ind w:left="720" w:hanging="360"/>
+      </w:pPr>
+      <w:rPr>
+        <w:rFonts w:ascii="Symbol" w:hAnsi="Symbol" w:hint="default"/>
+        <w:sz w:val="20"/>
+      </w:rPr>
+    </w:lvl>
+    <w:lvl w:ilvl="1" w:tentative="1">
+      <w:start w:val="1"/>
+      <w:numFmt w:val="bullet"/>
+      <w:lvlText w:val="o"/>
+      <w:lvlJc w:val="left"/>
+      <w:pPr>
+        <w:tabs>
+          <w:tab w:val="num" w:pos="1440"/>
+        </w:tabs>
+        <w:ind w:left="1440" w:hanging="360"/>
+      </w:pPr>
+      <w:rPr>
+        <w:rFonts w:ascii="Courier New" w:hAnsi="Courier New" w:hint="default"/>
+        <w:sz w:val="20"/>
+      </w:rPr>
+    </w:lvl>
+    <w:lvl w:ilvl="2" w:tentative="1">
+      <w:start w:val="1"/>
+      <w:numFmt w:val="bullet"/>
+      <w:lvlText w:val=""/>
+      <w:lvlJc w:val="left"/>
+      <w:pPr>
+        <w:tabs>
+          <w:tab w:val="num" w:pos="2160"/>
+        </w:tabs>
+        <w:ind w:left="2160" w:hanging="360"/>
+      </w:pPr>
+      <w:rPr>
+        <w:rFonts w:ascii="Wingdings" w:hAnsi="Wingdings" w:hint="default"/>
+        <w:sz w:val="20"/>
+      </w:rPr>
+    </w:lvl>
+    <w:lvl w:ilvl="3" w:tentative="1">
+      <w:start w:val="1"/>
+      <w:numFmt w:val="bullet"/>
+      <w:lvlText w:val=""/>
+      <w:lvlJc w:val="left"/>
+      <w:pPr>
+        <w:tabs>
+          <w:tab w:val="num" w:pos="2880"/>
+        </w:tabs>
+        <w:ind w:left="2880" w:hanging="360"/>
+      </w:pPr>
+      <w:rPr>
+        <w:rFonts w:ascii="Wingdings" w:hAnsi="Wingdings" w:hint="default"/>
+        <w:sz w:val="20"/>
+      </w:rPr>
+    </w:lvl>
+    <w:lvl w:ilvl="4" w:tentative="1">
+      <w:start w:val="1"/>
+      <w:numFmt w:val="bullet"/>
+      <w:lvlText w:val=""/>
+      <w:lvlJc w:val="left"/>
+      <w:pPr>
+        <w:tabs>
+          <w:tab w:val="num" w:pos="3600"/>
+        </w:tabs>
+        <w:ind w:left="3600" w:hanging="360"/>
+      </w:pPr>
+      <w:rPr>
+        <w:rFonts w:ascii="Wingdings" w:hAnsi="Wingdings" w:hint="default"/>
+        <w:sz w:val="20"/>
+      </w:rPr>
+    </w:lvl>
+    <w:lvl w:ilvl="5" w:tentative="1">
+      <w:start w:val="1"/>
+      <w:numFmt w:val="bullet"/>
+      <w:lvlText w:val=""/>
+      <w:lvlJc w:val="left"/>
+      <w:pPr>
+        <w:tabs>
+          <w:tab w:val="num" w:pos="4320"/>
+        </w:tabs>
+        <w:ind w:left="4320" w:hanging="360"/>
+      </w:pPr>
+      <w:rPr>
+        <w:rFonts w:ascii="Wingdings" w:hAnsi="Wingdings" w:hint="default"/>
+        <w:sz w:val="20"/>
+      </w:rPr>
+    </w:lvl>
+    <w:lvl w:ilvl="6" w:tentative="1">
+      <w:start w:val="1"/>
+      <w:numFmt w:val="bullet"/>
+      <w:lvlText w:val=""/>
+      <w:lvlJc w:val="left"/>
+      <w:pPr>
+        <w:tabs>
+          <w:tab w:val="num" w:pos="5040"/>
+        </w:tabs>
+        <w:ind w:left="5040" w:hanging="360"/>
+      </w:pPr>
+      <w:rPr>
+        <w:rFonts w:ascii="Wingdings" w:hAnsi="Wingdings" w:hint="default"/>
+        <w:sz w:val="20"/>
+      </w:rPr>
+    </w:lvl>
+    <w:lvl w:ilvl="7" w:tentative="1">
+      <w:start w:val="1"/>
+      <w:numFmt w:val="bullet"/>
+      <w:lvlText w:val=""/>
+      <w:lvlJc w:val="left"/>
+      <w:pPr>
+        <w:tabs>
+          <w:tab w:val="num" w:pos="5760"/>
+        </w:tabs>
+        <w:ind w:left="5760" w:hanging="360"/>
+      </w:pPr>
+      <w:rPr>
+        <w:rFonts w:ascii="Wingdings" w:hAnsi="Wingdings" w:hint="default"/>
+        <w:sz w:val="20"/>
+      </w:rPr>
+    </w:lvl>
+    <w:lvl w:ilvl="8" w:tentative="1">
+      <w:start w:val="1"/>
+      <w:numFmt w:val="bullet"/>
+      <w:lvlText w:val=""/>
+      <w:lvlJc w:val="left"/>
+      <w:pPr>
+        <w:tabs>
+          <w:tab w:val="num" w:pos="6480"/>
+        </w:tabs>
+        <w:ind w:left="6480" w:hanging="360"/>
+      </w:pPr>
+      <w:rPr>
+        <w:rFonts w:ascii="Wingdings" w:hAnsi="Wingdings" w:hint="default"/>
+        <w:sz w:val="20"/>
+      </w:rPr>
+    </w:lvl>
+  </w:abstractNum>
+  <w:num w:numId="1" w16cid:durableId="386341283">
+    <w:abstractNumId w:val="2"/>
+  </w:num>
+  <w:num w:numId="2" w16cid:durableId="895969491">
+    <w:abstractNumId w:val="1"/>
+  </w:num>
+  <w:num w:numId="3" w16cid:durableId="1301685924">
+    <w:abstractNumId w:val="0"/>
+  </w:num>
+</w:numbering>
 </file>
 
 <file path=word/styles.xml><?xml version="1.0" encoding="utf-8"?>
@@ -866,7 +1873,6 @@
   <w:style w:type="character" w:default="1" w:styleId="Fuentedeprrafopredeter">
     <w:name w:val="Default Paragraph Font"/>
     <w:uiPriority w:val="1"/>
-    <w:semiHidden/>
     <w:unhideWhenUsed/>
   </w:style>
   <w:style w:type="table" w:default="1" w:styleId="Tablanormal">

</xml_diff>

<commit_message>
docs: avance de herramienta para programar el proyecto
</commit_message>
<xml_diff>
--- a/Proyecto-Final.docx
+++ b/Proyecto-Final.docx
@@ -826,6 +826,147 @@
         </w:rPr>
         <w:t xml:space="preserve"> (cuando el cliente ya ha sido atendido).</w:t>
       </w:r>
+    </w:p>
+    <w:p>
+      <w:pPr>
+        <w:rPr>
+          <w:sz w:val="28"/>
+          <w:szCs w:val="28"/>
+        </w:rPr>
+      </w:pPr>
+    </w:p>
+    <w:p>
+      <w:pPr>
+        <w:rPr>
+          <w:sz w:val="28"/>
+          <w:szCs w:val="28"/>
+        </w:rPr>
+      </w:pPr>
+      <w:r>
+        <w:rPr>
+          <w:sz w:val="28"/>
+          <w:szCs w:val="28"/>
+        </w:rPr>
+        <w:t xml:space="preserve">Después avanzamos </w:t>
+      </w:r>
+      <w:r>
+        <w:rPr>
+          <w:sz w:val="28"/>
+          <w:szCs w:val="28"/>
+        </w:rPr>
+        <w:t xml:space="preserve">mi compañero y yo continuamos con el desarrollo del </w:t>
+      </w:r>
+      <w:r>
+        <w:rPr>
+          <w:b/>
+          <w:bCs/>
+          <w:sz w:val="28"/>
+          <w:szCs w:val="28"/>
+        </w:rPr>
+        <w:t>Sistema de Gestión de Turnos</w:t>
+      </w:r>
+      <w:r>
+        <w:rPr>
+          <w:sz w:val="28"/>
+          <w:szCs w:val="28"/>
+        </w:rPr>
+        <w:t xml:space="preserve">. Para ello abrimos </w:t>
+      </w:r>
+      <w:r>
+        <w:rPr>
+          <w:b/>
+          <w:bCs/>
+          <w:sz w:val="28"/>
+          <w:szCs w:val="28"/>
+        </w:rPr>
+        <w:t>Visual Studio Code</w:t>
+      </w:r>
+      <w:r>
+        <w:rPr>
+          <w:sz w:val="28"/>
+          <w:szCs w:val="28"/>
+        </w:rPr>
+        <w:t xml:space="preserve">, instalamos </w:t>
+      </w:r>
+      <w:r>
+        <w:rPr>
+          <w:b/>
+          <w:bCs/>
+          <w:sz w:val="28"/>
+          <w:szCs w:val="28"/>
+        </w:rPr>
+        <w:t>Python versión 3.14.7</w:t>
+      </w:r>
+      <w:r>
+        <w:rPr>
+          <w:sz w:val="28"/>
+          <w:szCs w:val="28"/>
+        </w:rPr>
+        <w:t xml:space="preserve"> y creamos una carpeta destinada a guardar el ejemplo de prueba, a la cual llamamos:</w:t>
+      </w:r>
+    </w:p>
+    <w:p>
+      <w:pPr>
+        <w:rPr>
+          <w:sz w:val="28"/>
+          <w:szCs w:val="28"/>
+        </w:rPr>
+      </w:pPr>
+      <w:r>
+        <w:rPr>
+          <w:sz w:val="28"/>
+          <w:szCs w:val="28"/>
+        </w:rPr>
+        <w:lastRenderedPageBreak/>
+        <w:t>proyecto_final_SGCT/sistema_gestion_turnos.py</w:t>
+      </w:r>
+    </w:p>
+    <w:p>
+      <w:pPr>
+        <w:rPr>
+          <w:sz w:val="28"/>
+          <w:szCs w:val="28"/>
+        </w:rPr>
+      </w:pPr>
+      <w:r>
+        <w:rPr>
+          <w:sz w:val="28"/>
+          <w:szCs w:val="28"/>
+        </w:rPr>
+        <w:t xml:space="preserve">Una vez configurado el entorno, abrimos el archivo en Visual Studio Code y añadimos un ejemplo inicial para verificar su funcionamiento. Al comprobar que todo estaba en orden, comenzamos a implementar las funcionalidades del sistema de gestión de turnos, siguiendo la lógica definida en los </w:t>
+      </w:r>
+      <w:proofErr w:type="spellStart"/>
+      <w:r>
+        <w:rPr>
+          <w:sz w:val="28"/>
+          <w:szCs w:val="28"/>
+        </w:rPr>
+        <w:t>sprints</w:t>
+      </w:r>
+      <w:proofErr w:type="spellEnd"/>
+      <w:r>
+        <w:rPr>
+          <w:sz w:val="28"/>
+          <w:szCs w:val="28"/>
+        </w:rPr>
+        <w:t xml:space="preserve"> anteriores.</w:t>
+      </w:r>
+    </w:p>
+    <w:p>
+      <w:pPr>
+        <w:rPr>
+          <w:sz w:val="28"/>
+          <w:szCs w:val="28"/>
+        </w:rPr>
+      </w:pPr>
+    </w:p>
+    <w:p>
+      <w:pPr>
+        <w:rPr>
+          <w:sz w:val="28"/>
+          <w:szCs w:val="28"/>
+        </w:rPr>
+      </w:pPr>
     </w:p>
     <w:p>
       <w:pPr>

</xml_diff>

<commit_message>
docs: Avance del sprint de la semana 2 programando 3 turnos del proyecto
</commit_message>
<xml_diff>
--- a/Proyecto-Final.docx
+++ b/Proyecto-Final.docx
@@ -950,6 +950,529 @@
           <w:szCs w:val="28"/>
         </w:rPr>
         <w:t xml:space="preserve"> anteriores.</w:t>
+      </w:r>
+    </w:p>
+    <w:p>
+      <w:pPr>
+        <w:rPr>
+          <w:sz w:val="28"/>
+          <w:szCs w:val="28"/>
+        </w:rPr>
+      </w:pPr>
+      <w:r>
+        <w:rPr>
+          <w:sz w:val="28"/>
+          <w:szCs w:val="28"/>
+        </w:rPr>
+        <w:t>En</w:t>
+      </w:r>
+      <w:r>
+        <w:rPr>
+          <w:sz w:val="28"/>
+          <w:szCs w:val="28"/>
+        </w:rPr>
+        <w:t>tonces para el sprint de la semana 2</w:t>
+      </w:r>
+      <w:r>
+        <w:rPr>
+          <w:sz w:val="28"/>
+          <w:szCs w:val="28"/>
+        </w:rPr>
+        <w:t xml:space="preserve"> la meta fue implementar el mecanismo de almacenamiento </w:t>
+      </w:r>
+      <w:r>
+        <w:rPr>
+          <w:b/>
+          <w:bCs/>
+          <w:sz w:val="28"/>
+          <w:szCs w:val="28"/>
+        </w:rPr>
+        <w:t xml:space="preserve">FIFO (First In, First </w:t>
+      </w:r>
+      <w:proofErr w:type="spellStart"/>
+      <w:r>
+        <w:rPr>
+          <w:b/>
+          <w:bCs/>
+          <w:sz w:val="28"/>
+          <w:szCs w:val="28"/>
+        </w:rPr>
+        <w:t>Out</w:t>
+      </w:r>
+      <w:proofErr w:type="spellEnd"/>
+      <w:r>
+        <w:rPr>
+          <w:b/>
+          <w:bCs/>
+          <w:sz w:val="28"/>
+          <w:szCs w:val="28"/>
+        </w:rPr>
+        <w:t>)</w:t>
+      </w:r>
+      <w:r>
+        <w:rPr>
+          <w:sz w:val="28"/>
+          <w:szCs w:val="28"/>
+        </w:rPr>
+        <w:t xml:space="preserve">, donde el primer cliente en llegar es también el primero en ser atendido. El objetivo específico era programar la escritura de la cola con sus operaciones fundamentales: </w:t>
+      </w:r>
+      <w:r>
+        <w:rPr>
+          <w:b/>
+          <w:bCs/>
+          <w:sz w:val="28"/>
+          <w:szCs w:val="28"/>
+        </w:rPr>
+        <w:t>encolar</w:t>
+      </w:r>
+      <w:r>
+        <w:rPr>
+          <w:sz w:val="28"/>
+          <w:szCs w:val="28"/>
+        </w:rPr>
+        <w:t xml:space="preserve"> y </w:t>
+      </w:r>
+      <w:r>
+        <w:rPr>
+          <w:b/>
+          <w:bCs/>
+          <w:sz w:val="28"/>
+          <w:szCs w:val="28"/>
+        </w:rPr>
+        <w:t>desencolar</w:t>
+      </w:r>
+      <w:r>
+        <w:rPr>
+          <w:sz w:val="28"/>
+          <w:szCs w:val="28"/>
+        </w:rPr>
+        <w:t xml:space="preserve">. El </w:t>
+      </w:r>
+      <w:r>
+        <w:rPr>
+          <w:b/>
+          <w:bCs/>
+          <w:sz w:val="28"/>
+          <w:szCs w:val="28"/>
+        </w:rPr>
+        <w:t>mínimo producto viable</w:t>
+      </w:r>
+      <w:r>
+        <w:rPr>
+          <w:sz w:val="28"/>
+          <w:szCs w:val="28"/>
+        </w:rPr>
+        <w:t xml:space="preserve"> consistía en un programa por consola que permitiera agregar al menos tres turnos.</w:t>
+      </w:r>
+    </w:p>
+    <w:p>
+      <w:pPr>
+        <w:rPr>
+          <w:sz w:val="28"/>
+          <w:szCs w:val="28"/>
+        </w:rPr>
+      </w:pPr>
+      <w:r>
+        <w:rPr>
+          <w:sz w:val="28"/>
+          <w:szCs w:val="28"/>
+        </w:rPr>
+        <w:t xml:space="preserve">Para cumplir con esto, iniciamos el desarrollo en </w:t>
+      </w:r>
+      <w:r>
+        <w:rPr>
+          <w:b/>
+          <w:bCs/>
+          <w:sz w:val="28"/>
+          <w:szCs w:val="28"/>
+        </w:rPr>
+        <w:t>Python dentro de Visual Studio</w:t>
+      </w:r>
+      <w:r>
+        <w:rPr>
+          <w:sz w:val="28"/>
+          <w:szCs w:val="28"/>
+        </w:rPr>
+        <w:t xml:space="preserve">. Primero definimos el </w:t>
+      </w:r>
+      <w:r>
+        <w:rPr>
+          <w:b/>
+          <w:bCs/>
+          <w:sz w:val="28"/>
+          <w:szCs w:val="28"/>
+        </w:rPr>
+        <w:t>nombre del proyecto</w:t>
+      </w:r>
+      <w:r>
+        <w:rPr>
+          <w:sz w:val="28"/>
+          <w:szCs w:val="28"/>
+        </w:rPr>
+        <w:t xml:space="preserve">, la </w:t>
+      </w:r>
+      <w:r>
+        <w:rPr>
+          <w:b/>
+          <w:bCs/>
+          <w:sz w:val="28"/>
+          <w:szCs w:val="28"/>
+        </w:rPr>
+        <w:t>materia</w:t>
+      </w:r>
+      <w:r>
+        <w:rPr>
+          <w:sz w:val="28"/>
+          <w:szCs w:val="28"/>
+        </w:rPr>
+        <w:t xml:space="preserve"> y lo que se pedía: la cola FIFO. Después, creamos la estructura del turno mediante una clase llamada </w:t>
+      </w:r>
+      <w:r>
+        <w:rPr>
+          <w:b/>
+          <w:bCs/>
+          <w:sz w:val="28"/>
+          <w:szCs w:val="28"/>
+        </w:rPr>
+        <w:t>Turno</w:t>
+      </w:r>
+      <w:r>
+        <w:rPr>
+          <w:sz w:val="28"/>
+          <w:szCs w:val="28"/>
+        </w:rPr>
+        <w:t>, en la cual declaramos las variables definidas en el sprint anterior (</w:t>
+      </w:r>
+      <w:proofErr w:type="spellStart"/>
+      <w:r>
+        <w:rPr>
+          <w:sz w:val="28"/>
+          <w:szCs w:val="28"/>
+        </w:rPr>
+        <w:t>id_turno</w:t>
+      </w:r>
+      <w:proofErr w:type="spellEnd"/>
+      <w:r>
+        <w:rPr>
+          <w:sz w:val="28"/>
+          <w:szCs w:val="28"/>
+        </w:rPr>
+        <w:t xml:space="preserve">, </w:t>
+      </w:r>
+      <w:proofErr w:type="spellStart"/>
+      <w:r>
+        <w:rPr>
+          <w:sz w:val="28"/>
+          <w:szCs w:val="28"/>
+        </w:rPr>
+        <w:t>nombre_cliente</w:t>
+      </w:r>
+      <w:proofErr w:type="spellEnd"/>
+      <w:r>
+        <w:rPr>
+          <w:sz w:val="28"/>
+          <w:szCs w:val="28"/>
+        </w:rPr>
+        <w:t xml:space="preserve">, </w:t>
+      </w:r>
+      <w:proofErr w:type="spellStart"/>
+      <w:r>
+        <w:rPr>
+          <w:sz w:val="28"/>
+          <w:szCs w:val="28"/>
+        </w:rPr>
+        <w:t>tipo_trámite</w:t>
+      </w:r>
+      <w:proofErr w:type="spellEnd"/>
+      <w:r>
+        <w:rPr>
+          <w:sz w:val="28"/>
+          <w:szCs w:val="28"/>
+        </w:rPr>
+        <w:t xml:space="preserve"> y estado).</w:t>
+      </w:r>
+    </w:p>
+    <w:p>
+      <w:pPr>
+        <w:rPr>
+          <w:sz w:val="28"/>
+          <w:szCs w:val="28"/>
+        </w:rPr>
+      </w:pPr>
+      <w:r>
+        <w:rPr>
+          <w:sz w:val="28"/>
+          <w:szCs w:val="28"/>
+        </w:rPr>
+        <w:t xml:space="preserve">Posteriormente, diseñamos la estructura de la cola de turnos con una clase llamada </w:t>
+      </w:r>
+      <w:proofErr w:type="spellStart"/>
+      <w:r>
+        <w:rPr>
+          <w:b/>
+          <w:bCs/>
+          <w:sz w:val="28"/>
+          <w:szCs w:val="28"/>
+        </w:rPr>
+        <w:t>ColaTurnos</w:t>
+      </w:r>
+      <w:proofErr w:type="spellEnd"/>
+      <w:r>
+        <w:rPr>
+          <w:sz w:val="28"/>
+          <w:szCs w:val="28"/>
+        </w:rPr>
+        <w:t xml:space="preserve">, donde establecimos la </w:t>
+      </w:r>
+      <w:r>
+        <w:rPr>
+          <w:b/>
+          <w:bCs/>
+          <w:sz w:val="28"/>
+          <w:szCs w:val="28"/>
+        </w:rPr>
+        <w:t>capacidad máxima</w:t>
+      </w:r>
+      <w:r>
+        <w:rPr>
+          <w:sz w:val="28"/>
+          <w:szCs w:val="28"/>
+        </w:rPr>
+        <w:t xml:space="preserve"> de 10. Dentro de esta clase implementamos la operación de </w:t>
+      </w:r>
+      <w:r>
+        <w:rPr>
+          <w:b/>
+          <w:bCs/>
+          <w:sz w:val="28"/>
+          <w:szCs w:val="28"/>
+        </w:rPr>
+        <w:t>encolar</w:t>
+      </w:r>
+      <w:r>
+        <w:rPr>
+          <w:sz w:val="28"/>
+          <w:szCs w:val="28"/>
+        </w:rPr>
+        <w:t xml:space="preserve">: se registraba el turno con las variables </w:t>
+      </w:r>
+      <w:proofErr w:type="spellStart"/>
+      <w:r>
+        <w:rPr>
+          <w:b/>
+          <w:bCs/>
+          <w:sz w:val="28"/>
+          <w:szCs w:val="28"/>
+        </w:rPr>
+        <w:t>nombre_cliente</w:t>
+      </w:r>
+      <w:proofErr w:type="spellEnd"/>
+      <w:r>
+        <w:rPr>
+          <w:sz w:val="28"/>
+          <w:szCs w:val="28"/>
+        </w:rPr>
+        <w:t xml:space="preserve"> y </w:t>
+      </w:r>
+      <w:proofErr w:type="spellStart"/>
+      <w:r>
+        <w:rPr>
+          <w:b/>
+          <w:bCs/>
+          <w:sz w:val="28"/>
+          <w:szCs w:val="28"/>
+        </w:rPr>
+        <w:t>tipo_trámite</w:t>
+      </w:r>
+      <w:proofErr w:type="spellEnd"/>
+      <w:r>
+        <w:rPr>
+          <w:sz w:val="28"/>
+          <w:szCs w:val="28"/>
+        </w:rPr>
+        <w:t xml:space="preserve">, se generaba el número de turno con </w:t>
+      </w:r>
+      <w:proofErr w:type="spellStart"/>
+      <w:proofErr w:type="gramStart"/>
+      <w:r>
+        <w:rPr>
+          <w:sz w:val="28"/>
+          <w:szCs w:val="28"/>
+        </w:rPr>
+        <w:t>self.contador</w:t>
+      </w:r>
+      <w:proofErr w:type="gramEnd"/>
+      <w:r>
+        <w:rPr>
+          <w:sz w:val="28"/>
+          <w:szCs w:val="28"/>
+        </w:rPr>
+        <w:t>_turnos</w:t>
+      </w:r>
+      <w:proofErr w:type="spellEnd"/>
+      <w:r>
+        <w:rPr>
+          <w:sz w:val="28"/>
+          <w:szCs w:val="28"/>
+        </w:rPr>
+        <w:t xml:space="preserve"> += 1, se creaba el nuevo objeto </w:t>
+      </w:r>
+      <w:r>
+        <w:rPr>
+          <w:b/>
+          <w:bCs/>
+          <w:sz w:val="28"/>
+          <w:szCs w:val="28"/>
+        </w:rPr>
+        <w:t>Turno</w:t>
+      </w:r>
+      <w:r>
+        <w:rPr>
+          <w:sz w:val="28"/>
+          <w:szCs w:val="28"/>
+        </w:rPr>
+        <w:t>, se agregaba a la cola y se mostraba la confirmación.</w:t>
+      </w:r>
+    </w:p>
+    <w:p>
+      <w:pPr>
+        <w:rPr>
+          <w:sz w:val="28"/>
+          <w:szCs w:val="28"/>
+        </w:rPr>
+      </w:pPr>
+      <w:r>
+        <w:rPr>
+          <w:sz w:val="28"/>
+          <w:szCs w:val="28"/>
+        </w:rPr>
+        <w:t>El sistema quedó organizado con las siguientes funcionalidades:</w:t>
+      </w:r>
+    </w:p>
+    <w:p>
+      <w:pPr>
+        <w:numPr>
+          <w:ilvl w:val="0"/>
+          <w:numId w:val="4"/>
+        </w:numPr>
+        <w:rPr>
+          <w:sz w:val="28"/>
+          <w:szCs w:val="28"/>
+        </w:rPr>
+      </w:pPr>
+      <w:r>
+        <w:rPr>
+          <w:sz w:val="28"/>
+          <w:szCs w:val="28"/>
+        </w:rPr>
+        <w:t xml:space="preserve">Registrar hasta </w:t>
+      </w:r>
+      <w:r>
+        <w:rPr>
+          <w:b/>
+          <w:bCs/>
+          <w:sz w:val="28"/>
+          <w:szCs w:val="28"/>
+        </w:rPr>
+        <w:t>3 turnos</w:t>
+      </w:r>
+      <w:r>
+        <w:rPr>
+          <w:sz w:val="28"/>
+          <w:szCs w:val="28"/>
+        </w:rPr>
+        <w:t xml:space="preserve"> como prueba inicial.</w:t>
+      </w:r>
+    </w:p>
+    <w:p>
+      <w:pPr>
+        <w:numPr>
+          <w:ilvl w:val="0"/>
+          <w:numId w:val="4"/>
+        </w:numPr>
+        <w:rPr>
+          <w:sz w:val="28"/>
+          <w:szCs w:val="28"/>
+        </w:rPr>
+      </w:pPr>
+      <w:r>
+        <w:rPr>
+          <w:sz w:val="28"/>
+          <w:szCs w:val="28"/>
+        </w:rPr>
+        <w:t>Mostrar el número de turnos en la cola.</w:t>
+      </w:r>
+    </w:p>
+    <w:p>
+      <w:pPr>
+        <w:numPr>
+          <w:ilvl w:val="0"/>
+          <w:numId w:val="4"/>
+        </w:numPr>
+        <w:rPr>
+          <w:sz w:val="28"/>
+          <w:szCs w:val="28"/>
+        </w:rPr>
+      </w:pPr>
+      <w:r>
+        <w:rPr>
+          <w:sz w:val="28"/>
+          <w:szCs w:val="28"/>
+        </w:rPr>
+        <w:t>Consultar el siguiente turno en espera.</w:t>
+      </w:r>
+    </w:p>
+    <w:p>
+      <w:pPr>
+        <w:numPr>
+          <w:ilvl w:val="0"/>
+          <w:numId w:val="4"/>
+        </w:numPr>
+        <w:rPr>
+          <w:sz w:val="28"/>
+          <w:szCs w:val="28"/>
+        </w:rPr>
+      </w:pPr>
+      <w:r>
+        <w:rPr>
+          <w:sz w:val="28"/>
+          <w:szCs w:val="28"/>
+        </w:rPr>
+        <w:t>Atender al primer cliente en llegar (siguiendo la lógica FIFO).</w:t>
+      </w:r>
+    </w:p>
+    <w:p>
+      <w:pPr>
+        <w:numPr>
+          <w:ilvl w:val="0"/>
+          <w:numId w:val="4"/>
+        </w:numPr>
+        <w:rPr>
+          <w:sz w:val="28"/>
+          <w:szCs w:val="28"/>
+        </w:rPr>
+      </w:pPr>
+      <w:r>
+        <w:rPr>
+          <w:sz w:val="28"/>
+          <w:szCs w:val="28"/>
+        </w:rPr>
+        <w:t>Verificar nuevamente el número de turnos en la cola después de atender al cliente.</w:t>
+      </w:r>
+    </w:p>
+    <w:p>
+      <w:pPr>
+        <w:rPr>
+          <w:sz w:val="28"/>
+          <w:szCs w:val="28"/>
+        </w:rPr>
+      </w:pPr>
+      <w:r>
+        <w:rPr>
+          <w:sz w:val="28"/>
+          <w:szCs w:val="28"/>
+        </w:rPr>
+        <w:t>De esta manera, logramos un programa funcional que simula la gestión de turnos bajo el esquema FIFO, respetando la capacidad máxima de 10 y cumpliendo con el mínimo producto viable solicitado en el sprint.</w:t>
       </w:r>
     </w:p>
     <w:p>
@@ -1102,6 +1625,155 @@
     </w:lvl>
   </w:abstractNum>
   <w:abstractNum w:abstractNumId="1" w15:restartNumberingAfterBreak="0">
+    <w:nsid w:val="37B14C84"/>
+    <w:multiLevelType w:val="multilevel"/>
+    <w:tmpl w:val="625489D0"/>
+    <w:lvl w:ilvl="0">
+      <w:start w:val="1"/>
+      <w:numFmt w:val="bullet"/>
+      <w:lvlText w:val=""/>
+      <w:lvlJc w:val="left"/>
+      <w:pPr>
+        <w:tabs>
+          <w:tab w:val="num" w:pos="720"/>
+        </w:tabs>
+        <w:ind w:left="720" w:hanging="360"/>
+      </w:pPr>
+      <w:rPr>
+        <w:rFonts w:ascii="Symbol" w:hAnsi="Symbol" w:hint="default"/>
+        <w:sz w:val="20"/>
+      </w:rPr>
+    </w:lvl>
+    <w:lvl w:ilvl="1" w:tentative="1">
+      <w:start w:val="1"/>
+      <w:numFmt w:val="bullet"/>
+      <w:lvlText w:val="o"/>
+      <w:lvlJc w:val="left"/>
+      <w:pPr>
+        <w:tabs>
+          <w:tab w:val="num" w:pos="1440"/>
+        </w:tabs>
+        <w:ind w:left="1440" w:hanging="360"/>
+      </w:pPr>
+      <w:rPr>
+        <w:rFonts w:ascii="Courier New" w:hAnsi="Courier New" w:hint="default"/>
+        <w:sz w:val="20"/>
+      </w:rPr>
+    </w:lvl>
+    <w:lvl w:ilvl="2" w:tentative="1">
+      <w:start w:val="1"/>
+      <w:numFmt w:val="bullet"/>
+      <w:lvlText w:val=""/>
+      <w:lvlJc w:val="left"/>
+      <w:pPr>
+        <w:tabs>
+          <w:tab w:val="num" w:pos="2160"/>
+        </w:tabs>
+        <w:ind w:left="2160" w:hanging="360"/>
+      </w:pPr>
+      <w:rPr>
+        <w:rFonts w:ascii="Wingdings" w:hAnsi="Wingdings" w:hint="default"/>
+        <w:sz w:val="20"/>
+      </w:rPr>
+    </w:lvl>
+    <w:lvl w:ilvl="3" w:tentative="1">
+      <w:start w:val="1"/>
+      <w:numFmt w:val="bullet"/>
+      <w:lvlText w:val=""/>
+      <w:lvlJc w:val="left"/>
+      <w:pPr>
+        <w:tabs>
+          <w:tab w:val="num" w:pos="2880"/>
+        </w:tabs>
+        <w:ind w:left="2880" w:hanging="360"/>
+      </w:pPr>
+      <w:rPr>
+        <w:rFonts w:ascii="Wingdings" w:hAnsi="Wingdings" w:hint="default"/>
+        <w:sz w:val="20"/>
+      </w:rPr>
+    </w:lvl>
+    <w:lvl w:ilvl="4" w:tentative="1">
+      <w:start w:val="1"/>
+      <w:numFmt w:val="bullet"/>
+      <w:lvlText w:val=""/>
+      <w:lvlJc w:val="left"/>
+      <w:pPr>
+        <w:tabs>
+          <w:tab w:val="num" w:pos="3600"/>
+        </w:tabs>
+        <w:ind w:left="3600" w:hanging="360"/>
+      </w:pPr>
+      <w:rPr>
+        <w:rFonts w:ascii="Wingdings" w:hAnsi="Wingdings" w:hint="default"/>
+        <w:sz w:val="20"/>
+      </w:rPr>
+    </w:lvl>
+    <w:lvl w:ilvl="5" w:tentative="1">
+      <w:start w:val="1"/>
+      <w:numFmt w:val="bullet"/>
+      <w:lvlText w:val=""/>
+      <w:lvlJc w:val="left"/>
+      <w:pPr>
+        <w:tabs>
+          <w:tab w:val="num" w:pos="4320"/>
+        </w:tabs>
+        <w:ind w:left="4320" w:hanging="360"/>
+      </w:pPr>
+      <w:rPr>
+        <w:rFonts w:ascii="Wingdings" w:hAnsi="Wingdings" w:hint="default"/>
+        <w:sz w:val="20"/>
+      </w:rPr>
+    </w:lvl>
+    <w:lvl w:ilvl="6" w:tentative="1">
+      <w:start w:val="1"/>
+      <w:numFmt w:val="bullet"/>
+      <w:lvlText w:val=""/>
+      <w:lvlJc w:val="left"/>
+      <w:pPr>
+        <w:tabs>
+          <w:tab w:val="num" w:pos="5040"/>
+        </w:tabs>
+        <w:ind w:left="5040" w:hanging="360"/>
+      </w:pPr>
+      <w:rPr>
+        <w:rFonts w:ascii="Wingdings" w:hAnsi="Wingdings" w:hint="default"/>
+        <w:sz w:val="20"/>
+      </w:rPr>
+    </w:lvl>
+    <w:lvl w:ilvl="7" w:tentative="1">
+      <w:start w:val="1"/>
+      <w:numFmt w:val="bullet"/>
+      <w:lvlText w:val=""/>
+      <w:lvlJc w:val="left"/>
+      <w:pPr>
+        <w:tabs>
+          <w:tab w:val="num" w:pos="5760"/>
+        </w:tabs>
+        <w:ind w:left="5760" w:hanging="360"/>
+      </w:pPr>
+      <w:rPr>
+        <w:rFonts w:ascii="Wingdings" w:hAnsi="Wingdings" w:hint="default"/>
+        <w:sz w:val="20"/>
+      </w:rPr>
+    </w:lvl>
+    <w:lvl w:ilvl="8" w:tentative="1">
+      <w:start w:val="1"/>
+      <w:numFmt w:val="bullet"/>
+      <w:lvlText w:val=""/>
+      <w:lvlJc w:val="left"/>
+      <w:pPr>
+        <w:tabs>
+          <w:tab w:val="num" w:pos="6480"/>
+        </w:tabs>
+        <w:ind w:left="6480" w:hanging="360"/>
+      </w:pPr>
+      <w:rPr>
+        <w:rFonts w:ascii="Wingdings" w:hAnsi="Wingdings" w:hint="default"/>
+        <w:sz w:val="20"/>
+      </w:rPr>
+    </w:lvl>
+  </w:abstractNum>
+  <w:abstractNum w:abstractNumId="2" w15:restartNumberingAfterBreak="0">
     <w:nsid w:val="44BB0C41"/>
     <w:multiLevelType w:val="multilevel"/>
     <w:tmpl w:val="7E144B04"/>
@@ -1250,7 +1922,7 @@
       </w:rPr>
     </w:lvl>
   </w:abstractNum>
-  <w:abstractNum w:abstractNumId="2" w15:restartNumberingAfterBreak="0">
+  <w:abstractNum w:abstractNumId="3" w15:restartNumberingAfterBreak="0">
     <w:nsid w:val="49674A8C"/>
     <w:multiLevelType w:val="multilevel"/>
     <w:tmpl w:val="357419EE"/>
@@ -1400,13 +2072,16 @@
     </w:lvl>
   </w:abstractNum>
   <w:num w:numId="1" w16cid:durableId="386341283">
-    <w:abstractNumId w:val="2"/>
+    <w:abstractNumId w:val="3"/>
   </w:num>
   <w:num w:numId="2" w16cid:durableId="895969491">
-    <w:abstractNumId w:val="1"/>
+    <w:abstractNumId w:val="2"/>
   </w:num>
   <w:num w:numId="3" w16cid:durableId="1301685924">
     <w:abstractNumId w:val="0"/>
+  </w:num>
+  <w:num w:numId="4" w16cid:durableId="1009865622">
+    <w:abstractNumId w:val="1"/>
   </w:num>
 </w:numbering>
 </file>

</xml_diff>

<commit_message>
Docs: Planteamiento del Sprint 3 sobre generador de turnos consecutivos
</commit_message>
<xml_diff>
--- a/Proyecto-Final.docx
+++ b/Proyecto-Final.docx
@@ -47,6 +47,23 @@
     <w:p>
       <w:pPr>
         <w:rPr>
+          <w:rFonts w:ascii="Arial" w:hAnsi="Arial" w:cs="Arial"/>
+          <w:sz w:val="32"/>
+          <w:szCs w:val="32"/>
+        </w:rPr>
+      </w:pPr>
+      <w:r>
+        <w:rPr>
+          <w:rFonts w:ascii="Arial" w:hAnsi="Arial" w:cs="Arial"/>
+          <w:sz w:val="32"/>
+          <w:szCs w:val="32"/>
+        </w:rPr>
+        <w:t>Avance de la semana 1</w:t>
+      </w:r>
+    </w:p>
+    <w:p>
+      <w:pPr>
+        <w:rPr>
           <w:sz w:val="28"/>
           <w:szCs w:val="28"/>
         </w:rPr>
@@ -274,6 +291,21 @@
         </w:rPr>
         <w:lastRenderedPageBreak/>
         <w:t xml:space="preserve">Estructura de datos </w:t>
+      </w:r>
+    </w:p>
+    <w:p>
+      <w:pPr>
+        <w:rPr>
+          <w:sz w:val="28"/>
+          <w:szCs w:val="28"/>
+        </w:rPr>
+      </w:pPr>
+      <w:r>
+        <w:rPr>
+          <w:sz w:val="28"/>
+          <w:szCs w:val="28"/>
+        </w:rPr>
+        <w:t>Avance de la semana 2</w:t>
       </w:r>
     </w:p>
     <w:p>
@@ -895,7 +927,17 @@
           <w:sz w:val="28"/>
           <w:szCs w:val="28"/>
         </w:rPr>
-        <w:t>Python versión 3.14.7</w:t>
+        <w:t xml:space="preserve">Python versión </w:t>
+      </w:r>
+      <w:r>
+        <w:rPr>
+          <w:b/>
+          <w:bCs/>
+          <w:sz w:val="28"/>
+          <w:szCs w:val="28"/>
+        </w:rPr>
+        <w:lastRenderedPageBreak/>
+        <w:t>3.14.7</w:t>
       </w:r>
       <w:r>
         <w:rPr>
@@ -917,7 +959,6 @@
           <w:sz w:val="28"/>
           <w:szCs w:val="28"/>
         </w:rPr>
-        <w:lastRenderedPageBreak/>
         <w:t>proyecto_final_SGCT/sistema_gestion_turnos.py</w:t>
       </w:r>
     </w:p>
@@ -1472,6 +1513,7 @@
           <w:sz w:val="28"/>
           <w:szCs w:val="28"/>
         </w:rPr>
+        <w:lastRenderedPageBreak/>
         <w:t>De esta manera, logramos un programa funcional que simula la gestión de turnos bajo el esquema FIFO, respetando la capacidad máxima de 10 y cumpliendo con el mínimo producto viable solicitado en el sprint.</w:t>
       </w:r>
     </w:p>
@@ -1482,6 +1524,312 @@
           <w:szCs w:val="28"/>
         </w:rPr>
       </w:pPr>
+    </w:p>
+    <w:p>
+      <w:pPr>
+        <w:rPr>
+          <w:sz w:val="28"/>
+          <w:szCs w:val="28"/>
+        </w:rPr>
+      </w:pPr>
+    </w:p>
+    <w:p>
+      <w:pPr>
+        <w:rPr>
+          <w:sz w:val="28"/>
+          <w:szCs w:val="28"/>
+        </w:rPr>
+      </w:pPr>
+      <w:r>
+        <w:rPr>
+          <w:sz w:val="28"/>
+          <w:szCs w:val="28"/>
+        </w:rPr>
+        <w:t>Estructura de datos</w:t>
+      </w:r>
+    </w:p>
+    <w:p>
+      <w:pPr>
+        <w:rPr>
+          <w:sz w:val="28"/>
+          <w:szCs w:val="28"/>
+        </w:rPr>
+      </w:pPr>
+      <w:r>
+        <w:rPr>
+          <w:sz w:val="28"/>
+          <w:szCs w:val="28"/>
+        </w:rPr>
+        <w:t>Avance de la semana 3</w:t>
+      </w:r>
+    </w:p>
+    <w:p>
+      <w:pPr>
+        <w:rPr>
+          <w:sz w:val="28"/>
+          <w:szCs w:val="28"/>
+        </w:rPr>
+      </w:pPr>
+      <w:r>
+        <w:rPr>
+          <w:sz w:val="28"/>
+          <w:szCs w:val="28"/>
+        </w:rPr>
+        <w:t>Tras haber definido en las semanas anteriores las variables del sistema (</w:t>
+      </w:r>
+      <w:proofErr w:type="spellStart"/>
+      <w:proofErr w:type="gramStart"/>
+      <w:r>
+        <w:rPr>
+          <w:sz w:val="28"/>
+          <w:szCs w:val="28"/>
+        </w:rPr>
+        <w:t>id.turno</w:t>
+      </w:r>
+      <w:proofErr w:type="spellEnd"/>
+      <w:proofErr w:type="gramEnd"/>
+      <w:r>
+        <w:rPr>
+          <w:sz w:val="28"/>
+          <w:szCs w:val="28"/>
+        </w:rPr>
+        <w:t xml:space="preserve">, </w:t>
+      </w:r>
+      <w:proofErr w:type="spellStart"/>
+      <w:proofErr w:type="gramStart"/>
+      <w:r>
+        <w:rPr>
+          <w:sz w:val="28"/>
+          <w:szCs w:val="28"/>
+        </w:rPr>
+        <w:t>nombre.cliente</w:t>
+      </w:r>
+      <w:proofErr w:type="spellEnd"/>
+      <w:proofErr w:type="gramEnd"/>
+      <w:r>
+        <w:rPr>
+          <w:sz w:val="28"/>
+          <w:szCs w:val="28"/>
+        </w:rPr>
+        <w:t xml:space="preserve">, </w:t>
+      </w:r>
+      <w:proofErr w:type="spellStart"/>
+      <w:proofErr w:type="gramStart"/>
+      <w:r>
+        <w:rPr>
+          <w:sz w:val="28"/>
+          <w:szCs w:val="28"/>
+        </w:rPr>
+        <w:t>tipo.trámite</w:t>
+      </w:r>
+      <w:proofErr w:type="spellEnd"/>
+      <w:proofErr w:type="gramEnd"/>
+      <w:r>
+        <w:rPr>
+          <w:sz w:val="28"/>
+          <w:szCs w:val="28"/>
+        </w:rPr>
+        <w:t>, estado), la estructura lógica del diagrama de flujo y la configuración de la cola FIFO en Python (sistema_gestion_turnos.py) mediante Visual Studio Code,</w:t>
+      </w:r>
+      <w:r>
+        <w:rPr>
+          <w:sz w:val="28"/>
+          <w:szCs w:val="28"/>
+        </w:rPr>
+        <w:t xml:space="preserve"> </w:t>
+      </w:r>
+      <w:r>
+        <w:rPr>
+          <w:sz w:val="28"/>
+          <w:szCs w:val="28"/>
+        </w:rPr>
+        <w:t>información de</w:t>
+      </w:r>
+      <w:r>
+        <w:rPr>
+          <w:sz w:val="28"/>
+          <w:szCs w:val="28"/>
+        </w:rPr>
+        <w:t xml:space="preserve"> </w:t>
+      </w:r>
+      <w:r>
+        <w:rPr>
+          <w:sz w:val="28"/>
+          <w:szCs w:val="28"/>
+        </w:rPr>
+        <w:t xml:space="preserve">los </w:t>
+      </w:r>
+      <w:r>
+        <w:rPr>
+          <w:sz w:val="28"/>
+          <w:szCs w:val="28"/>
+        </w:rPr>
+        <w:t>Sprint</w:t>
+      </w:r>
+      <w:r>
+        <w:rPr>
+          <w:sz w:val="28"/>
+          <w:szCs w:val="28"/>
+        </w:rPr>
+        <w:t xml:space="preserve"> 1 y 2</w:t>
+      </w:r>
+      <w:r>
+        <w:rPr>
+          <w:sz w:val="28"/>
+          <w:szCs w:val="28"/>
+        </w:rPr>
+        <w:t xml:space="preserve">, empezamos a realizar </w:t>
+      </w:r>
+      <w:r>
+        <w:rPr>
+          <w:sz w:val="28"/>
+          <w:szCs w:val="28"/>
+        </w:rPr>
+        <w:t>el 3</w:t>
+      </w:r>
+      <w:r>
+        <w:rPr>
+          <w:sz w:val="28"/>
+          <w:szCs w:val="28"/>
+        </w:rPr>
+        <w:t xml:space="preserve"> </w:t>
+      </w:r>
+      <w:r>
+        <w:rPr>
+          <w:sz w:val="28"/>
+          <w:szCs w:val="28"/>
+        </w:rPr>
+        <w:t xml:space="preserve">Sprint. El objetivo </w:t>
+      </w:r>
+      <w:r>
+        <w:rPr>
+          <w:sz w:val="28"/>
+          <w:szCs w:val="28"/>
+        </w:rPr>
+        <w:t xml:space="preserve">para </w:t>
+      </w:r>
+      <w:r>
+        <w:rPr>
+          <w:sz w:val="28"/>
+          <w:szCs w:val="28"/>
+        </w:rPr>
+        <w:t>elaborar el</w:t>
+      </w:r>
+      <w:r>
+        <w:rPr>
+          <w:sz w:val="28"/>
+          <w:szCs w:val="28"/>
+        </w:rPr>
+        <w:t xml:space="preserve"> primer commit de la semana es cumplir con el Mínimo Producto Viable (MVP) mediante la automatización en la generación de folios consecutivos.</w:t>
+      </w:r>
+    </w:p>
+    <w:p>
+      <w:pPr>
+        <w:rPr>
+          <w:sz w:val="28"/>
+          <w:szCs w:val="28"/>
+        </w:rPr>
+      </w:pPr>
+      <w:r>
+        <w:rPr>
+          <w:sz w:val="28"/>
+          <w:szCs w:val="28"/>
+        </w:rPr>
+        <w:t xml:space="preserve">Dándole seguimiento al proyecto en esta semana 3 </w:t>
+      </w:r>
+      <w:r>
+        <w:rPr>
+          <w:sz w:val="28"/>
+          <w:szCs w:val="28"/>
+        </w:rPr>
+        <w:t>añadimos</w:t>
+      </w:r>
+      <w:r>
+        <w:rPr>
+          <w:sz w:val="28"/>
+          <w:szCs w:val="28"/>
+        </w:rPr>
+        <w:t xml:space="preserve"> unas líneas de </w:t>
+      </w:r>
+      <w:r>
+        <w:rPr>
+          <w:sz w:val="28"/>
+          <w:szCs w:val="28"/>
+        </w:rPr>
+        <w:t>código qué consistían</w:t>
+      </w:r>
+      <w:r>
+        <w:rPr>
+          <w:sz w:val="28"/>
+          <w:szCs w:val="28"/>
+        </w:rPr>
+        <w:t xml:space="preserve"> </w:t>
+      </w:r>
+      <w:r>
+        <w:rPr>
+          <w:sz w:val="28"/>
+          <w:szCs w:val="28"/>
+        </w:rPr>
+        <w:t xml:space="preserve">en el orden de llegada del cliente </w:t>
+      </w:r>
+      <w:r>
+        <w:rPr>
+          <w:sz w:val="28"/>
+          <w:szCs w:val="28"/>
+        </w:rPr>
+        <w:t xml:space="preserve">un </w:t>
+      </w:r>
+      <w:proofErr w:type="gramStart"/>
+      <w:r>
+        <w:rPr>
+          <w:sz w:val="28"/>
+          <w:szCs w:val="28"/>
+        </w:rPr>
+        <w:t>ejemplo seria</w:t>
+      </w:r>
+      <w:proofErr w:type="gramEnd"/>
+      <w:r>
+        <w:rPr>
+          <w:sz w:val="28"/>
+          <w:szCs w:val="28"/>
+        </w:rPr>
+        <w:t>: A</w:t>
+      </w:r>
+      <w:r>
+        <w:rPr>
+          <w:sz w:val="28"/>
+          <w:szCs w:val="28"/>
+        </w:rPr>
+        <w:t>-</w:t>
+      </w:r>
+      <w:r>
+        <w:rPr>
+          <w:sz w:val="28"/>
+          <w:szCs w:val="28"/>
+        </w:rPr>
+        <w:t>01, A</w:t>
+      </w:r>
+      <w:r>
+        <w:rPr>
+          <w:sz w:val="28"/>
+          <w:szCs w:val="28"/>
+        </w:rPr>
+        <w:t>-</w:t>
+      </w:r>
+      <w:r>
+        <w:rPr>
+          <w:sz w:val="28"/>
+          <w:szCs w:val="28"/>
+        </w:rPr>
+        <w:t>02, A</w:t>
+      </w:r>
+      <w:r>
+        <w:rPr>
+          <w:sz w:val="28"/>
+          <w:szCs w:val="28"/>
+        </w:rPr>
+        <w:t>-03</w:t>
+      </w:r>
     </w:p>
     <w:p>
       <w:pPr>
@@ -2689,6 +3037,7 @@
   <w:style w:type="character" w:default="1" w:styleId="Fuentedeprrafopredeter">
     <w:name w:val="Default Paragraph Font"/>
     <w:uiPriority w:val="1"/>
+    <w:semiHidden/>
     <w:unhideWhenUsed/>
   </w:style>
   <w:style w:type="table" w:default="1" w:styleId="Tablanormal">

</xml_diff>

<commit_message>
Docs: Implementacion de generacion automatica de folios
</commit_message>
<xml_diff>
--- a/Proyecto-Final.docx
+++ b/Proyecto-Final.docx
@@ -376,10 +376,6 @@
           <w:ilvl w:val="0"/>
           <w:numId w:val="1"/>
         </w:numPr>
-        <w:rPr>
-          <w:sz w:val="28"/>
-          <w:szCs w:val="28"/>
-        </w:rPr>
       </w:pPr>
       <w:proofErr w:type="spellStart"/>
       <w:proofErr w:type="gramStart"/>
@@ -387,18 +383,12 @@
         <w:rPr>
           <w:b/>
           <w:bCs/>
-          <w:sz w:val="28"/>
-          <w:szCs w:val="28"/>
         </w:rPr>
         <w:t>id.turno</w:t>
       </w:r>
       <w:proofErr w:type="spellEnd"/>
       <w:proofErr w:type="gramEnd"/>
       <w:r>
-        <w:rPr>
-          <w:sz w:val="28"/>
-          <w:szCs w:val="28"/>
-        </w:rPr>
         <w:t xml:space="preserve"> → variable entera.</w:t>
       </w:r>
     </w:p>
@@ -408,10 +398,6 @@
           <w:ilvl w:val="0"/>
           <w:numId w:val="1"/>
         </w:numPr>
-        <w:rPr>
-          <w:sz w:val="28"/>
-          <w:szCs w:val="28"/>
-        </w:rPr>
       </w:pPr>
       <w:proofErr w:type="spellStart"/>
       <w:proofErr w:type="gramStart"/>
@@ -419,18 +405,12 @@
         <w:rPr>
           <w:b/>
           <w:bCs/>
-          <w:sz w:val="28"/>
-          <w:szCs w:val="28"/>
         </w:rPr>
         <w:t>nombre.cliente</w:t>
       </w:r>
       <w:proofErr w:type="spellEnd"/>
       <w:proofErr w:type="gramEnd"/>
       <w:r>
-        <w:rPr>
-          <w:sz w:val="28"/>
-          <w:szCs w:val="28"/>
-        </w:rPr>
         <w:t xml:space="preserve"> → variable de texto.</w:t>
       </w:r>
     </w:p>
@@ -440,10 +420,6 @@
           <w:ilvl w:val="0"/>
           <w:numId w:val="1"/>
         </w:numPr>
-        <w:rPr>
-          <w:sz w:val="28"/>
-          <w:szCs w:val="28"/>
-        </w:rPr>
       </w:pPr>
       <w:proofErr w:type="spellStart"/>
       <w:proofErr w:type="gramStart"/>
@@ -451,18 +427,12 @@
         <w:rPr>
           <w:b/>
           <w:bCs/>
-          <w:sz w:val="28"/>
-          <w:szCs w:val="28"/>
         </w:rPr>
         <w:t>tipo.trámite</w:t>
       </w:r>
       <w:proofErr w:type="spellEnd"/>
       <w:proofErr w:type="gramEnd"/>
       <w:r>
-        <w:rPr>
-          <w:sz w:val="28"/>
-          <w:szCs w:val="28"/>
-        </w:rPr>
         <w:t xml:space="preserve"> → variable de texto.</w:t>
       </w:r>
     </w:p>
@@ -472,57 +442,35 @@
           <w:ilvl w:val="0"/>
           <w:numId w:val="1"/>
         </w:numPr>
-        <w:rPr>
-          <w:sz w:val="28"/>
-          <w:szCs w:val="28"/>
-        </w:rPr>
-      </w:pPr>
-      <w:r>
-        <w:rPr>
-          <w:b/>
-          <w:bCs/>
-          <w:sz w:val="28"/>
-          <w:szCs w:val="28"/>
+      </w:pPr>
+      <w:r>
+        <w:rPr>
+          <w:b/>
+          <w:bCs/>
         </w:rPr>
         <w:t>estado</w:t>
       </w:r>
       <w:r>
-        <w:rPr>
-          <w:sz w:val="28"/>
-          <w:szCs w:val="28"/>
-        </w:rPr>
         <w:t xml:space="preserve"> → variable de texto, con valores </w:t>
       </w:r>
       <w:r>
         <w:rPr>
           <w:i/>
           <w:iCs/>
-          <w:sz w:val="28"/>
-          <w:szCs w:val="28"/>
         </w:rPr>
         <w:t>“en espera”</w:t>
       </w:r>
       <w:r>
-        <w:rPr>
-          <w:sz w:val="28"/>
-          <w:szCs w:val="28"/>
-        </w:rPr>
         <w:t xml:space="preserve"> o </w:t>
       </w:r>
       <w:r>
         <w:rPr>
           <w:i/>
           <w:iCs/>
-          <w:sz w:val="28"/>
-          <w:szCs w:val="28"/>
         </w:rPr>
         <w:t>“atendiendo”</w:t>
       </w:r>
       <w:r>
-        <w:rPr>
-          <w:sz w:val="28"/>
-          <w:szCs w:val="28"/>
-        </w:rPr>
         <w:t>.</w:t>
       </w:r>
     </w:p>
@@ -547,25 +495,15 @@
           <w:ilvl w:val="0"/>
           <w:numId w:val="2"/>
         </w:numPr>
-        <w:rPr>
-          <w:sz w:val="28"/>
-          <w:szCs w:val="28"/>
-        </w:rPr>
-      </w:pPr>
-      <w:r>
-        <w:rPr>
-          <w:b/>
-          <w:bCs/>
-          <w:sz w:val="28"/>
-          <w:szCs w:val="28"/>
+      </w:pPr>
+      <w:r>
+        <w:rPr>
+          <w:b/>
+          <w:bCs/>
         </w:rPr>
         <w:t>cola = []</w:t>
       </w:r>
       <w:r>
-        <w:rPr>
-          <w:sz w:val="28"/>
-          <w:szCs w:val="28"/>
-        </w:rPr>
         <w:t xml:space="preserve"> → lista donde se almacenarán los clientes.</w:t>
       </w:r>
     </w:p>
@@ -575,10 +513,6 @@
           <w:ilvl w:val="0"/>
           <w:numId w:val="2"/>
         </w:numPr>
-        <w:rPr>
-          <w:sz w:val="28"/>
-          <w:szCs w:val="28"/>
-        </w:rPr>
       </w:pPr>
       <w:proofErr w:type="spellStart"/>
       <w:proofErr w:type="gramStart"/>
@@ -586,8 +520,6 @@
         <w:rPr>
           <w:b/>
           <w:bCs/>
-          <w:sz w:val="28"/>
-          <w:szCs w:val="28"/>
         </w:rPr>
         <w:t>contador.turnos</w:t>
       </w:r>
@@ -597,16 +529,10 @@
         <w:rPr>
           <w:b/>
           <w:bCs/>
-          <w:sz w:val="28"/>
-          <w:szCs w:val="28"/>
         </w:rPr>
         <w:t xml:space="preserve"> = 0</w:t>
       </w:r>
       <w:r>
-        <w:rPr>
-          <w:sz w:val="28"/>
-          <w:szCs w:val="28"/>
-        </w:rPr>
         <w:t xml:space="preserve"> → registro de la cantidad de clientes.</w:t>
       </w:r>
     </w:p>
@@ -616,10 +542,6 @@
           <w:ilvl w:val="0"/>
           <w:numId w:val="2"/>
         </w:numPr>
-        <w:rPr>
-          <w:sz w:val="28"/>
-          <w:szCs w:val="28"/>
-        </w:rPr>
       </w:pPr>
       <w:proofErr w:type="spellStart"/>
       <w:proofErr w:type="gramStart"/>
@@ -627,8 +549,6 @@
         <w:rPr>
           <w:b/>
           <w:bCs/>
-          <w:sz w:val="28"/>
-          <w:szCs w:val="28"/>
         </w:rPr>
         <w:t>capacidad.máxima</w:t>
       </w:r>
@@ -638,16 +558,10 @@
         <w:rPr>
           <w:b/>
           <w:bCs/>
-          <w:sz w:val="28"/>
-          <w:szCs w:val="28"/>
         </w:rPr>
         <w:t xml:space="preserve"> = 10</w:t>
       </w:r>
       <w:r>
-        <w:rPr>
-          <w:sz w:val="28"/>
-          <w:szCs w:val="28"/>
-        </w:rPr>
         <w:t xml:space="preserve"> → límite de personas en la fila.</w:t>
       </w:r>
     </w:p>
@@ -657,27 +571,17 @@
           <w:ilvl w:val="0"/>
           <w:numId w:val="2"/>
         </w:numPr>
-        <w:rPr>
-          <w:sz w:val="28"/>
-          <w:szCs w:val="28"/>
-        </w:rPr>
       </w:pPr>
       <w:proofErr w:type="spellStart"/>
       <w:r>
         <w:rPr>
           <w:b/>
           <w:bCs/>
-          <w:sz w:val="28"/>
-          <w:szCs w:val="28"/>
         </w:rPr>
         <w:t>opc</w:t>
       </w:r>
       <w:proofErr w:type="spellEnd"/>
       <w:r>
-        <w:rPr>
-          <w:sz w:val="28"/>
-          <w:szCs w:val="28"/>
-        </w:rPr>
         <w:t xml:space="preserve"> → variable para guardar las opciones seleccionadas.</w:t>
       </w:r>
     </w:p>
@@ -718,25 +622,15 @@
           <w:ilvl w:val="0"/>
           <w:numId w:val="3"/>
         </w:numPr>
-        <w:rPr>
-          <w:sz w:val="28"/>
-          <w:szCs w:val="28"/>
-        </w:rPr>
-      </w:pPr>
-      <w:r>
-        <w:rPr>
-          <w:b/>
-          <w:bCs/>
-          <w:sz w:val="28"/>
-          <w:szCs w:val="28"/>
+      </w:pPr>
+      <w:r>
+        <w:rPr>
+          <w:b/>
+          <w:bCs/>
         </w:rPr>
         <w:t>Tomar turno</w:t>
       </w:r>
       <w:r>
-        <w:rPr>
-          <w:sz w:val="28"/>
-          <w:szCs w:val="28"/>
-        </w:rPr>
         <w:t>.</w:t>
       </w:r>
     </w:p>
@@ -746,25 +640,15 @@
           <w:ilvl w:val="0"/>
           <w:numId w:val="3"/>
         </w:numPr>
-        <w:rPr>
-          <w:sz w:val="28"/>
-          <w:szCs w:val="28"/>
-        </w:rPr>
-      </w:pPr>
-      <w:r>
-        <w:rPr>
-          <w:b/>
-          <w:bCs/>
-          <w:sz w:val="28"/>
-          <w:szCs w:val="28"/>
+      </w:pPr>
+      <w:r>
+        <w:rPr>
+          <w:b/>
+          <w:bCs/>
         </w:rPr>
         <w:t>Tiempo en espera</w:t>
       </w:r>
       <w:r>
-        <w:rPr>
-          <w:sz w:val="28"/>
-          <w:szCs w:val="28"/>
-        </w:rPr>
         <w:t>.</w:t>
       </w:r>
     </w:p>
@@ -774,25 +658,15 @@
           <w:ilvl w:val="0"/>
           <w:numId w:val="3"/>
         </w:numPr>
-        <w:rPr>
-          <w:sz w:val="28"/>
-          <w:szCs w:val="28"/>
-        </w:rPr>
-      </w:pPr>
-      <w:r>
-        <w:rPr>
-          <w:b/>
-          <w:bCs/>
-          <w:sz w:val="28"/>
-          <w:szCs w:val="28"/>
+      </w:pPr>
+      <w:r>
+        <w:rPr>
+          <w:b/>
+          <w:bCs/>
         </w:rPr>
         <w:t>Atendiendo el turno</w:t>
       </w:r>
       <w:r>
-        <w:rPr>
-          <w:sz w:val="28"/>
-          <w:szCs w:val="28"/>
-        </w:rPr>
         <w:t>.</w:t>
       </w:r>
     </w:p>
@@ -802,33 +676,16 @@
           <w:ilvl w:val="0"/>
           <w:numId w:val="3"/>
         </w:numPr>
-        <w:rPr>
-          <w:sz w:val="28"/>
-          <w:szCs w:val="28"/>
-        </w:rPr>
-      </w:pPr>
-      <w:r>
-        <w:rPr>
-          <w:b/>
-          <w:bCs/>
-          <w:sz w:val="28"/>
-          <w:szCs w:val="28"/>
+      </w:pPr>
+      <w:r>
+        <w:rPr>
+          <w:b/>
+          <w:bCs/>
         </w:rPr>
         <w:t>Atendido</w:t>
       </w:r>
       <w:r>
-        <w:rPr>
-          <w:sz w:val="28"/>
-          <w:szCs w:val="28"/>
-        </w:rPr>
-        <w:t>-</w:t>
-      </w:r>
-      <w:r>
-        <w:rPr>
-          <w:sz w:val="28"/>
-          <w:szCs w:val="28"/>
-        </w:rPr>
-        <w:t xml:space="preserve">siguiente. </w:t>
+        <w:t xml:space="preserve">-siguiente. </w:t>
       </w:r>
     </w:p>
     <w:p>
@@ -837,25 +694,15 @@
           <w:ilvl w:val="0"/>
           <w:numId w:val="3"/>
         </w:numPr>
-        <w:rPr>
-          <w:sz w:val="28"/>
-          <w:szCs w:val="28"/>
-        </w:rPr>
-      </w:pPr>
-      <w:r>
-        <w:rPr>
-          <w:b/>
-          <w:bCs/>
-          <w:sz w:val="28"/>
-          <w:szCs w:val="28"/>
+      </w:pPr>
+      <w:r>
+        <w:rPr>
+          <w:b/>
+          <w:bCs/>
         </w:rPr>
         <w:t>Finalizar el turno</w:t>
       </w:r>
       <w:r>
-        <w:rPr>
-          <w:sz w:val="28"/>
-          <w:szCs w:val="28"/>
-        </w:rPr>
         <w:t xml:space="preserve"> (cuando el cliente ya ha sido atendido).</w:t>
       </w:r>
     </w:p>
@@ -927,53 +774,43 @@
           <w:sz w:val="28"/>
           <w:szCs w:val="28"/>
         </w:rPr>
-        <w:t xml:space="preserve">Python versión </w:t>
-      </w:r>
-      <w:r>
-        <w:rPr>
-          <w:b/>
-          <w:bCs/>
+        <w:t>Python versión 3.14.7</w:t>
+      </w:r>
+      <w:r>
+        <w:rPr>
+          <w:sz w:val="28"/>
+          <w:szCs w:val="28"/>
+        </w:rPr>
+        <w:t xml:space="preserve"> y creamos una carpeta destinada a guardar el ejemplo de prueba, a la cual llamamos:</w:t>
+      </w:r>
+      <w:r>
+        <w:rPr>
+          <w:sz w:val="28"/>
+          <w:szCs w:val="28"/>
+        </w:rPr>
+        <w:t xml:space="preserve"> </w:t>
+      </w:r>
+      <w:r>
+        <w:rPr>
+          <w:sz w:val="28"/>
+          <w:szCs w:val="28"/>
+        </w:rPr>
+        <w:t>proyecto_final_SGCT/sistema_gestion_turnos.py</w:t>
+      </w:r>
+    </w:p>
+    <w:p>
+      <w:pPr>
+        <w:rPr>
+          <w:sz w:val="28"/>
+          <w:szCs w:val="28"/>
+        </w:rPr>
+      </w:pPr>
+      <w:r>
+        <w:rPr>
           <w:sz w:val="28"/>
           <w:szCs w:val="28"/>
         </w:rPr>
         <w:lastRenderedPageBreak/>
-        <w:t>3.14.7</w:t>
-      </w:r>
-      <w:r>
-        <w:rPr>
-          <w:sz w:val="28"/>
-          <w:szCs w:val="28"/>
-        </w:rPr>
-        <w:t xml:space="preserve"> y creamos una carpeta destinada a guardar el ejemplo de prueba, a la cual llamamos:</w:t>
-      </w:r>
-    </w:p>
-    <w:p>
-      <w:pPr>
-        <w:rPr>
-          <w:sz w:val="28"/>
-          <w:szCs w:val="28"/>
-        </w:rPr>
-      </w:pPr>
-      <w:r>
-        <w:rPr>
-          <w:sz w:val="28"/>
-          <w:szCs w:val="28"/>
-        </w:rPr>
-        <w:t>proyecto_final_SGCT/sistema_gestion_turnos.py</w:t>
-      </w:r>
-    </w:p>
-    <w:p>
-      <w:pPr>
-        <w:rPr>
-          <w:sz w:val="28"/>
-          <w:szCs w:val="28"/>
-        </w:rPr>
-      </w:pPr>
-      <w:r>
-        <w:rPr>
-          <w:sz w:val="28"/>
-          <w:szCs w:val="28"/>
-        </w:rPr>
         <w:t xml:space="preserve">Una vez configurado el entorno, abrimos el archivo en Visual Studio Code y añadimos un ejemplo inicial para verificar su funcionamiento. Al comprobar que todo estaba en orden, comenzamos a implementar las funcionalidades del sistema de gestión de turnos, siguiendo la lógica definida en los </w:t>
       </w:r>
       <w:proofErr w:type="spellStart"/>
@@ -1513,38 +1350,38 @@
           <w:sz w:val="28"/>
           <w:szCs w:val="28"/>
         </w:rPr>
+        <w:t>De esta manera, logramos un programa funcional que simula la gestión de turnos bajo el esquema FIFO, respetando la capacidad máxima de 10 y cumpliendo con el mínimo producto viable solicitado en el sprint.</w:t>
+      </w:r>
+    </w:p>
+    <w:p>
+      <w:pPr>
+        <w:rPr>
+          <w:sz w:val="28"/>
+          <w:szCs w:val="28"/>
+        </w:rPr>
+      </w:pPr>
+    </w:p>
+    <w:p>
+      <w:pPr>
+        <w:rPr>
+          <w:sz w:val="28"/>
+          <w:szCs w:val="28"/>
+        </w:rPr>
+      </w:pPr>
+    </w:p>
+    <w:p>
+      <w:pPr>
+        <w:rPr>
+          <w:sz w:val="28"/>
+          <w:szCs w:val="28"/>
+        </w:rPr>
+      </w:pPr>
+      <w:r>
+        <w:rPr>
+          <w:sz w:val="28"/>
+          <w:szCs w:val="28"/>
+        </w:rPr>
         <w:lastRenderedPageBreak/>
-        <w:t>De esta manera, logramos un programa funcional que simula la gestión de turnos bajo el esquema FIFO, respetando la capacidad máxima de 10 y cumpliendo con el mínimo producto viable solicitado en el sprint.</w:t>
-      </w:r>
-    </w:p>
-    <w:p>
-      <w:pPr>
-        <w:rPr>
-          <w:sz w:val="28"/>
-          <w:szCs w:val="28"/>
-        </w:rPr>
-      </w:pPr>
-    </w:p>
-    <w:p>
-      <w:pPr>
-        <w:rPr>
-          <w:sz w:val="28"/>
-          <w:szCs w:val="28"/>
-        </w:rPr>
-      </w:pPr>
-    </w:p>
-    <w:p>
-      <w:pPr>
-        <w:rPr>
-          <w:sz w:val="28"/>
-          <w:szCs w:val="28"/>
-        </w:rPr>
-      </w:pPr>
-      <w:r>
-        <w:rPr>
-          <w:sz w:val="28"/>
-          <w:szCs w:val="28"/>
-        </w:rPr>
         <w:t>Estructura de datos</w:t>
       </w:r>
     </w:p>
@@ -1829,6 +1666,53 @@
           <w:szCs w:val="28"/>
         </w:rPr>
         <w:t>-03</w:t>
+      </w:r>
+    </w:p>
+    <w:p>
+      <w:pPr>
+        <w:rPr>
+          <w:sz w:val="28"/>
+          <w:szCs w:val="28"/>
+        </w:rPr>
+      </w:pPr>
+      <w:r>
+        <w:rPr>
+          <w:sz w:val="28"/>
+          <w:szCs w:val="28"/>
+        </w:rPr>
+        <w:t xml:space="preserve">Creamos la estructura en Python dentro de sistema_gestion_turnos.py utilizando programación orientada a objetos: Definimos la clase Turno para guardar la información de cada persona.  Programamos en la clase </w:t>
+      </w:r>
+      <w:proofErr w:type="spellStart"/>
+      <w:r>
+        <w:rPr>
+          <w:sz w:val="28"/>
+          <w:szCs w:val="28"/>
+        </w:rPr>
+        <w:t>ColaTurnos</w:t>
+      </w:r>
+      <w:proofErr w:type="spellEnd"/>
+      <w:r>
+        <w:rPr>
+          <w:sz w:val="28"/>
+          <w:szCs w:val="28"/>
+        </w:rPr>
+        <w:t xml:space="preserve"> el método </w:t>
+      </w:r>
+      <w:proofErr w:type="spellStart"/>
+      <w:r>
+        <w:rPr>
+          <w:sz w:val="28"/>
+          <w:szCs w:val="28"/>
+        </w:rPr>
+        <w:t>encolar_turno</w:t>
+      </w:r>
+      <w:proofErr w:type="spellEnd"/>
+      <w:r>
+        <w:rPr>
+          <w:sz w:val="28"/>
+          <w:szCs w:val="28"/>
+        </w:rPr>
+        <w:t>, el cual genera de forma automática un folio consecutivo (como A-01, A-02, A-03) cada vez que alguien llega.  Agregamos los métodos para atender al primer cliente en llegar (FIFO) y consultar el estado de la fila.</w:t>
       </w:r>
     </w:p>
     <w:p>

</xml_diff>

<commit_message>
docs: definicion de que trata el Sprint 4
</commit_message>
<xml_diff>
--- a/Proyecto-Final.docx
+++ b/Proyecto-Final.docx
@@ -1722,6 +1722,74 @@
           <w:szCs w:val="28"/>
         </w:rPr>
       </w:pPr>
+    </w:p>
+    <w:p>
+      <w:pPr>
+        <w:rPr>
+          <w:sz w:val="28"/>
+          <w:szCs w:val="28"/>
+        </w:rPr>
+      </w:pPr>
+      <w:r>
+        <w:rPr>
+          <w:sz w:val="28"/>
+          <w:szCs w:val="28"/>
+        </w:rPr>
+        <w:br w:type="page"/>
+      </w:r>
+    </w:p>
+    <w:p>
+      <w:pPr>
+        <w:rPr>
+          <w:sz w:val="28"/>
+          <w:szCs w:val="28"/>
+        </w:rPr>
+      </w:pPr>
+      <w:r>
+        <w:rPr>
+          <w:sz w:val="28"/>
+          <w:szCs w:val="28"/>
+        </w:rPr>
+        <w:lastRenderedPageBreak/>
+        <w:t>Estructura de datos</w:t>
+      </w:r>
+    </w:p>
+    <w:p>
+      <w:pPr>
+        <w:rPr>
+          <w:sz w:val="28"/>
+          <w:szCs w:val="28"/>
+        </w:rPr>
+      </w:pPr>
+      <w:r>
+        <w:rPr>
+          <w:sz w:val="28"/>
+          <w:szCs w:val="28"/>
+        </w:rPr>
+        <w:t>Avance de la semana 4</w:t>
+      </w:r>
+    </w:p>
+    <w:p>
+      <w:pPr>
+        <w:rPr>
+          <w:sz w:val="28"/>
+          <w:szCs w:val="28"/>
+        </w:rPr>
+      </w:pPr>
+      <w:r>
+        <w:rPr>
+          <w:sz w:val="28"/>
+          <w:szCs w:val="28"/>
+        </w:rPr>
+        <w:t>Para el Sprint 4 s</w:t>
+      </w:r>
+      <w:r>
+        <w:rPr>
+          <w:sz w:val="28"/>
+          <w:szCs w:val="28"/>
+        </w:rPr>
+        <w:t>e establece la planificación y especificación técnica para el Módulo de Atención Continua en Ventanilla como Producto Mínimo Viable (MVP). Se define el modelo de interacción basado en la estructura de datos Cola (FIFO), estableciendo que al presionar la tecla [ENTER] se procesará y eliminará el turno actual, manteniendo en pantalla la visualización del turno activo y la previsualización del siguiente en espera.</w:t>
+      </w:r>
     </w:p>
     <w:p>
       <w:pPr>

</xml_diff>

<commit_message>
feat:implementar metodo despachar_siguiente_turno para el Sprint 4
</commit_message>
<xml_diff>
--- a/Proyecto-Final.docx
+++ b/Proyecto-Final.docx
@@ -1798,6 +1798,168 @@
           <w:szCs w:val="28"/>
         </w:rPr>
       </w:pPr>
+      <w:r>
+        <w:rPr>
+          <w:sz w:val="28"/>
+          <w:szCs w:val="28"/>
+        </w:rPr>
+        <w:t>S</w:t>
+      </w:r>
+      <w:r>
+        <w:rPr>
+          <w:sz w:val="28"/>
+          <w:szCs w:val="28"/>
+        </w:rPr>
+        <w:t xml:space="preserve">e añade el método </w:t>
+      </w:r>
+      <w:proofErr w:type="spellStart"/>
+      <w:r>
+        <w:rPr>
+          <w:sz w:val="28"/>
+          <w:szCs w:val="28"/>
+        </w:rPr>
+        <w:t>despachar_siguiente_</w:t>
+      </w:r>
+      <w:proofErr w:type="gramStart"/>
+      <w:r>
+        <w:rPr>
+          <w:sz w:val="28"/>
+          <w:szCs w:val="28"/>
+        </w:rPr>
+        <w:t>turno</w:t>
+      </w:r>
+      <w:proofErr w:type="spellEnd"/>
+      <w:r>
+        <w:rPr>
+          <w:sz w:val="28"/>
+          <w:szCs w:val="28"/>
+        </w:rPr>
+        <w:t>(</w:t>
+      </w:r>
+      <w:proofErr w:type="gramEnd"/>
+      <w:r>
+        <w:rPr>
+          <w:sz w:val="28"/>
+          <w:szCs w:val="28"/>
+        </w:rPr>
+        <w:t xml:space="preserve">) en la clase </w:t>
+      </w:r>
+      <w:proofErr w:type="spellStart"/>
+      <w:r>
+        <w:rPr>
+          <w:sz w:val="28"/>
+          <w:szCs w:val="28"/>
+        </w:rPr>
+        <w:t>ColaTurnos</w:t>
+      </w:r>
+      <w:proofErr w:type="spellEnd"/>
+      <w:r>
+        <w:rPr>
+          <w:sz w:val="28"/>
+          <w:szCs w:val="28"/>
+        </w:rPr>
+        <w:t xml:space="preserve">. La función remueve al cliente activo </w:t>
+      </w:r>
+      <w:proofErr w:type="gramStart"/>
+      <w:r>
+        <w:rPr>
+          <w:sz w:val="28"/>
+          <w:szCs w:val="28"/>
+        </w:rPr>
+        <w:t>con .pop</w:t>
+      </w:r>
+      <w:proofErr w:type="gramEnd"/>
+      <w:r>
+        <w:rPr>
+          <w:sz w:val="28"/>
+          <w:szCs w:val="28"/>
+        </w:rPr>
+        <w:t xml:space="preserve">(0) e imprime Atendiendo a: Turno # desplegando </w:t>
+      </w:r>
+      <w:proofErr w:type="spellStart"/>
+      <w:r>
+        <w:rPr>
+          <w:sz w:val="28"/>
+          <w:szCs w:val="28"/>
+        </w:rPr>
+        <w:t>id_turno</w:t>
+      </w:r>
+      <w:proofErr w:type="spellEnd"/>
+      <w:r>
+        <w:rPr>
+          <w:sz w:val="28"/>
+          <w:szCs w:val="28"/>
+        </w:rPr>
+        <w:t xml:space="preserve"> y </w:t>
+      </w:r>
+      <w:proofErr w:type="spellStart"/>
+      <w:r>
+        <w:rPr>
+          <w:sz w:val="28"/>
+          <w:szCs w:val="28"/>
+        </w:rPr>
+        <w:t>nombre_cliente</w:t>
+      </w:r>
+      <w:proofErr w:type="spellEnd"/>
+      <w:r>
+        <w:rPr>
+          <w:sz w:val="28"/>
+          <w:szCs w:val="28"/>
+        </w:rPr>
+        <w:t xml:space="preserve">. Si existen elementos restantes en </w:t>
+      </w:r>
+      <w:proofErr w:type="spellStart"/>
+      <w:proofErr w:type="gramStart"/>
+      <w:r>
+        <w:rPr>
+          <w:sz w:val="28"/>
+          <w:szCs w:val="28"/>
+        </w:rPr>
+        <w:t>self.cola</w:t>
+      </w:r>
+      <w:proofErr w:type="spellEnd"/>
+      <w:proofErr w:type="gramEnd"/>
+      <w:r>
+        <w:rPr>
+          <w:sz w:val="28"/>
+          <w:szCs w:val="28"/>
+        </w:rPr>
+        <w:t xml:space="preserve">, consulta </w:t>
+      </w:r>
+      <w:proofErr w:type="spellStart"/>
+      <w:proofErr w:type="gramStart"/>
+      <w:r>
+        <w:rPr>
+          <w:sz w:val="28"/>
+          <w:szCs w:val="28"/>
+        </w:rPr>
+        <w:t>self.cola</w:t>
+      </w:r>
+      <w:proofErr w:type="spellEnd"/>
+      <w:proofErr w:type="gramEnd"/>
+      <w:r>
+        <w:rPr>
+          <w:sz w:val="28"/>
+          <w:szCs w:val="28"/>
+        </w:rPr>
+        <w:t xml:space="preserve">[0] para mostrar Siguiente en espera: sin modificar la fila, o notifica que no quedan turnos. Se añade el mensaje de pausa </w:t>
+      </w:r>
+      <w:proofErr w:type="gramStart"/>
+      <w:r>
+        <w:rPr>
+          <w:sz w:val="28"/>
+          <w:szCs w:val="28"/>
+        </w:rPr>
+        <w:t>input(</w:t>
+      </w:r>
+      <w:proofErr w:type="gramEnd"/>
+      <w:r>
+        <w:rPr>
+          <w:sz w:val="28"/>
+          <w:szCs w:val="28"/>
+        </w:rPr>
+        <w:t>"Presiona Enter...") en el bloque principal de pruebas.</w:t>
+      </w:r>
     </w:p>
     <w:sectPr>
       <w:pgSz w:w="12240" w:h="15840"/>

</xml_diff>

<commit_message>
test: validacion de la ejecucion de despachar_siguiente_turno en terminal
</commit_message>
<xml_diff>
--- a/Proyecto-Final.docx
+++ b/Proyecto-Final.docx
@@ -1959,6 +1959,37 @@
           <w:szCs w:val="28"/>
         </w:rPr>
         <w:t>"Presiona Enter...") en el bloque principal de pruebas.</w:t>
+      </w:r>
+    </w:p>
+    <w:p>
+      <w:pPr>
+        <w:rPr>
+          <w:sz w:val="28"/>
+          <w:szCs w:val="28"/>
+        </w:rPr>
+      </w:pPr>
+      <w:r>
+        <w:rPr>
+          <w:sz w:val="28"/>
+          <w:szCs w:val="28"/>
+        </w:rPr>
+        <w:t xml:space="preserve">Se ejecutan las pruebas del Sprint 4 en la terminal de Visual Studio Code. Se comprueba la respuesta a la pausa por teclado y el avance correcto de la cola FIFO: al despachar el folio #A-02 (Eduardo Antonio), el sistema actualiza inmediatamente la pantalla y muestra como siguiente en espera al folio #A-03 (Daniela </w:t>
+      </w:r>
+      <w:proofErr w:type="spellStart"/>
+      <w:r>
+        <w:rPr>
+          <w:sz w:val="28"/>
+          <w:szCs w:val="28"/>
+        </w:rPr>
+        <w:t>Cardenas</w:t>
+      </w:r>
+      <w:proofErr w:type="spellEnd"/>
+      <w:r>
+        <w:rPr>
+          <w:sz w:val="28"/>
+          <w:szCs w:val="28"/>
+        </w:rPr>
+        <w:t>).</w:t>
       </w:r>
     </w:p>
     <w:sectPr>

</xml_diff>

<commit_message>
Docs: Avance del Sprint 5 Manejo de Filas Preferenciales/Prioridades
</commit_message>
<xml_diff>
--- a/Proyecto-Final.docx
+++ b/Proyecto-Final.docx
@@ -1990,6 +1990,67 @@
           <w:szCs w:val="28"/>
         </w:rPr>
         <w:t>).</w:t>
+      </w:r>
+    </w:p>
+    <w:p>
+      <w:pPr>
+        <w:rPr>
+          <w:sz w:val="28"/>
+          <w:szCs w:val="28"/>
+        </w:rPr>
+      </w:pPr>
+      <w:r>
+        <w:rPr>
+          <w:sz w:val="28"/>
+          <w:szCs w:val="28"/>
+        </w:rPr>
+        <w:br w:type="page"/>
+      </w:r>
+    </w:p>
+    <w:p>
+      <w:pPr>
+        <w:rPr>
+          <w:sz w:val="28"/>
+          <w:szCs w:val="28"/>
+        </w:rPr>
+      </w:pPr>
+      <w:r>
+        <w:rPr>
+          <w:sz w:val="28"/>
+          <w:szCs w:val="28"/>
+        </w:rPr>
+        <w:lastRenderedPageBreak/>
+        <w:t>Estructura de datos</w:t>
+      </w:r>
+    </w:p>
+    <w:p>
+      <w:pPr>
+        <w:rPr>
+          <w:sz w:val="28"/>
+          <w:szCs w:val="28"/>
+        </w:rPr>
+      </w:pPr>
+      <w:r>
+        <w:rPr>
+          <w:sz w:val="28"/>
+          <w:szCs w:val="28"/>
+        </w:rPr>
+        <w:t>Avance de la semana 5</w:t>
+      </w:r>
+    </w:p>
+    <w:p>
+      <w:pPr>
+        <w:rPr>
+          <w:sz w:val="28"/>
+          <w:szCs w:val="28"/>
+        </w:rPr>
+      </w:pPr>
+      <w:r>
+        <w:rPr>
+          <w:sz w:val="28"/>
+          <w:szCs w:val="28"/>
+        </w:rPr>
+        <w:t>Para el Sprint 5 se establece la planificación y especificación técnica para el Manejo de Filas Preferenciales y Prioridades. Se define el diseño de una arquitectura de doble cola que separa la fila regular y la preferencial, estableciendo que el sistema deberá procesar y despachar de manera prioritaria a los clientes preferenciales antes de atender a la fila regular.</w:t>
       </w:r>
     </w:p>
     <w:sectPr>

</xml_diff>

<commit_message>
Feat: implementar doble cola y prioridad de despacho preferencial
</commit_message>
<xml_diff>
--- a/Proyecto-Final.docx
+++ b/Proyecto-Final.docx
@@ -2051,6 +2051,101 @@
           <w:szCs w:val="28"/>
         </w:rPr>
         <w:t>Para el Sprint 5 se establece la planificación y especificación técnica para el Manejo de Filas Preferenciales y Prioridades. Se define el diseño de una arquitectura de doble cola que separa la fila regular y la preferencial, estableciendo que el sistema deberá procesar y despachar de manera prioritaria a los clientes preferenciales antes de atender a la fila regular.</w:t>
+      </w:r>
+    </w:p>
+    <w:p>
+      <w:pPr>
+        <w:rPr>
+          <w:sz w:val="28"/>
+          <w:szCs w:val="28"/>
+        </w:rPr>
+      </w:pPr>
+      <w:r>
+        <w:rPr>
+          <w:sz w:val="28"/>
+          <w:szCs w:val="28"/>
+        </w:rPr>
+        <w:t xml:space="preserve">Se actualiza la clase </w:t>
+      </w:r>
+      <w:proofErr w:type="spellStart"/>
+      <w:r>
+        <w:rPr>
+          <w:sz w:val="28"/>
+          <w:szCs w:val="28"/>
+        </w:rPr>
+        <w:t>ColaTurnos</w:t>
+      </w:r>
+      <w:proofErr w:type="spellEnd"/>
+      <w:r>
+        <w:rPr>
+          <w:sz w:val="28"/>
+          <w:szCs w:val="28"/>
+        </w:rPr>
+        <w:t xml:space="preserve"> integrando los atributos </w:t>
+      </w:r>
+      <w:proofErr w:type="spellStart"/>
+      <w:r>
+        <w:rPr>
+          <w:sz w:val="28"/>
+          <w:szCs w:val="28"/>
+        </w:rPr>
+        <w:t>cola_regular</w:t>
+      </w:r>
+      <w:proofErr w:type="spellEnd"/>
+      <w:r>
+        <w:rPr>
+          <w:sz w:val="28"/>
+          <w:szCs w:val="28"/>
+        </w:rPr>
+        <w:t xml:space="preserve"> y </w:t>
+      </w:r>
+      <w:proofErr w:type="spellStart"/>
+      <w:r>
+        <w:rPr>
+          <w:sz w:val="28"/>
+          <w:szCs w:val="28"/>
+        </w:rPr>
+        <w:t>cola_preferencial</w:t>
+      </w:r>
+      <w:proofErr w:type="spellEnd"/>
+      <w:r>
+        <w:rPr>
+          <w:sz w:val="28"/>
+          <w:szCs w:val="28"/>
+        </w:rPr>
+        <w:t xml:space="preserve">, así como los folios diferenciados mediante los prefijos A- y P-. Se añade el parámetro </w:t>
+      </w:r>
+      <w:proofErr w:type="spellStart"/>
+      <w:r>
+        <w:rPr>
+          <w:sz w:val="28"/>
+          <w:szCs w:val="28"/>
+        </w:rPr>
+        <w:t>es_preferencial</w:t>
+      </w:r>
+      <w:proofErr w:type="spellEnd"/>
+      <w:r>
+        <w:rPr>
+          <w:sz w:val="28"/>
+          <w:szCs w:val="28"/>
+        </w:rPr>
+        <w:t xml:space="preserve"> al método de encolado y se modifica la lógica de </w:t>
+      </w:r>
+      <w:proofErr w:type="spellStart"/>
+      <w:r>
+        <w:rPr>
+          <w:sz w:val="28"/>
+          <w:szCs w:val="28"/>
+        </w:rPr>
+        <w:t>despachar_siguiente_turno</w:t>
+      </w:r>
+      <w:proofErr w:type="spellEnd"/>
+      <w:r>
+        <w:rPr>
+          <w:sz w:val="28"/>
+          <w:szCs w:val="28"/>
+        </w:rPr>
+        <w:t>() para que evalúe y extraiga primero a los clientes preferenciales usando .pop(0), pasando a la fila regular únicamente cuando la preferencial quede vacía.</w:t>
       </w:r>
     </w:p>
     <w:sectPr>

</xml_diff>

<commit_message>
Test: validar orden de despacho prioritario en terminal
</commit_message>
<xml_diff>
--- a/Proyecto-Final.docx
+++ b/Proyecto-Final.docx
@@ -2137,7 +2137,15 @@
           <w:sz w:val="28"/>
           <w:szCs w:val="28"/>
         </w:rPr>
-        <w:t>despachar_siguiente_turno</w:t>
+        <w:t>despachar_siguiente_</w:t>
+      </w:r>
+      <w:proofErr w:type="gramStart"/>
+      <w:r>
+        <w:rPr>
+          <w:sz w:val="28"/>
+          <w:szCs w:val="28"/>
+        </w:rPr>
+        <w:t>turno</w:t>
       </w:r>
       <w:proofErr w:type="spellEnd"/>
       <w:r>
@@ -2145,7 +2153,62 @@
           <w:sz w:val="28"/>
           <w:szCs w:val="28"/>
         </w:rPr>
-        <w:t>() para que evalúe y extraiga primero a los clientes preferenciales usando .pop(0), pasando a la fila regular únicamente cuando la preferencial quede vacía.</w:t>
+        <w:t>(</w:t>
+      </w:r>
+      <w:proofErr w:type="gramEnd"/>
+      <w:r>
+        <w:rPr>
+          <w:sz w:val="28"/>
+          <w:szCs w:val="28"/>
+        </w:rPr>
+        <w:t xml:space="preserve">) para que evalúe y extraiga primero a los clientes preferenciales </w:t>
+      </w:r>
+      <w:proofErr w:type="gramStart"/>
+      <w:r>
+        <w:rPr>
+          <w:sz w:val="28"/>
+          <w:szCs w:val="28"/>
+        </w:rPr>
+        <w:t>usando .pop</w:t>
+      </w:r>
+      <w:proofErr w:type="gramEnd"/>
+      <w:r>
+        <w:rPr>
+          <w:sz w:val="28"/>
+          <w:szCs w:val="28"/>
+        </w:rPr>
+        <w:t>(0), pasando a la fila regular únicamente cuando la preferencial quede vacía.</w:t>
+      </w:r>
+    </w:p>
+    <w:p>
+      <w:pPr>
+        <w:rPr>
+          <w:sz w:val="28"/>
+          <w:szCs w:val="28"/>
+        </w:rPr>
+      </w:pPr>
+      <w:r>
+        <w:rPr>
+          <w:sz w:val="28"/>
+          <w:szCs w:val="28"/>
+        </w:rPr>
+        <w:t xml:space="preserve">Se ejecutan las pruebas del Sprint 5 en la terminal de Visual Studio Code utilizando los nombres de prueba de Jesús Arnoldo, Eduardo Antonio y Daniela </w:t>
+      </w:r>
+      <w:proofErr w:type="spellStart"/>
+      <w:r>
+        <w:rPr>
+          <w:sz w:val="28"/>
+          <w:szCs w:val="28"/>
+        </w:rPr>
+        <w:t>Cardenas</w:t>
+      </w:r>
+      <w:proofErr w:type="spellEnd"/>
+      <w:r>
+        <w:rPr>
+          <w:sz w:val="28"/>
+          <w:szCs w:val="28"/>
+        </w:rPr>
+        <w:t>. Se comprueba y valida el funcionamiento del despacho prioritario: el sistema procesa primero al cliente con folio preferencial (#P-01, Eduardo Antonio) antes de avanzar con los turnos regulares, cumpliendo correctamente con la regla de negocio establecida</w:t>
       </w:r>
     </w:p>
     <w:sectPr>

</xml_diff>

<commit_message>
Docs: Avance del Sprint 6 Calculo de Tiempos y Estadisticas en Memoria
</commit_message>
<xml_diff>
--- a/Proyecto-Final.docx
+++ b/Proyecto-Final.docx
@@ -2209,6 +2209,83 @@
           <w:szCs w:val="28"/>
         </w:rPr>
         <w:t>. Se comprueba y valida el funcionamiento del despacho prioritario: el sistema procesa primero al cliente con folio preferencial (#P-01, Eduardo Antonio) antes de avanzar con los turnos regulares, cumpliendo correctamente con la regla de negocio establecida</w:t>
+      </w:r>
+    </w:p>
+    <w:p>
+      <w:pPr>
+        <w:rPr>
+          <w:sz w:val="28"/>
+          <w:szCs w:val="28"/>
+        </w:rPr>
+      </w:pPr>
+      <w:r>
+        <w:rPr>
+          <w:sz w:val="28"/>
+          <w:szCs w:val="28"/>
+        </w:rPr>
+        <w:br w:type="page"/>
+      </w:r>
+    </w:p>
+    <w:p>
+      <w:pPr>
+        <w:rPr>
+          <w:sz w:val="28"/>
+          <w:szCs w:val="28"/>
+        </w:rPr>
+      </w:pPr>
+      <w:r>
+        <w:rPr>
+          <w:sz w:val="28"/>
+          <w:szCs w:val="28"/>
+        </w:rPr>
+        <w:lastRenderedPageBreak/>
+        <w:t xml:space="preserve">Estructura de datos </w:t>
+      </w:r>
+    </w:p>
+    <w:p>
+      <w:pPr>
+        <w:rPr>
+          <w:sz w:val="28"/>
+          <w:szCs w:val="28"/>
+        </w:rPr>
+      </w:pPr>
+      <w:r>
+        <w:rPr>
+          <w:sz w:val="28"/>
+          <w:szCs w:val="28"/>
+        </w:rPr>
+        <w:t>Avance de la semana 6</w:t>
+      </w:r>
+    </w:p>
+    <w:p>
+      <w:pPr>
+        <w:rPr>
+          <w:sz w:val="28"/>
+          <w:szCs w:val="28"/>
+        </w:rPr>
+      </w:pPr>
+      <w:r>
+        <w:rPr>
+          <w:sz w:val="28"/>
+          <w:szCs w:val="28"/>
+        </w:rPr>
+        <w:t>Para el Sprint 6 se establece la planificación y especificación técnica para el Cálculo de Tiempos y Estadísticas en Memoria. Se define el diseño funcional para incorporar el registro de la hora exacta de llegada (</w:t>
+      </w:r>
+      <w:proofErr w:type="spellStart"/>
+      <w:r>
+        <w:rPr>
+          <w:sz w:val="28"/>
+          <w:szCs w:val="28"/>
+        </w:rPr>
+        <w:t>tiempo_llegada</w:t>
+      </w:r>
+      <w:proofErr w:type="spellEnd"/>
+      <w:r>
+        <w:rPr>
+          <w:sz w:val="28"/>
+          <w:szCs w:val="28"/>
+        </w:rPr>
+        <w:t>) en cada objeto de tipo Turno, permitiendo proyectar y estimar el tiempo de espera de los clientes en función del volumen de las filas.</w:t>
       </w:r>
     </w:p>
     <w:sectPr>

</xml_diff>

<commit_message>
Feat: Integrar la logica de tiempos y la creacion de la interfaz en Tkinter
</commit_message>
<xml_diff>
--- a/Proyecto-Final.docx
+++ b/Proyecto-Final.docx
@@ -2286,6 +2286,37 @@
           <w:szCs w:val="28"/>
         </w:rPr>
         <w:t>) en cada objeto de tipo Turno, permitiendo proyectar y estimar el tiempo de espera de los clientes en función del volumen de las filas.</w:t>
+      </w:r>
+    </w:p>
+    <w:p>
+      <w:pPr>
+        <w:rPr>
+          <w:sz w:val="28"/>
+          <w:szCs w:val="28"/>
+        </w:rPr>
+      </w:pPr>
+      <w:r>
+        <w:rPr>
+          <w:sz w:val="28"/>
+          <w:szCs w:val="28"/>
+        </w:rPr>
+        <w:t xml:space="preserve">Junté la planeación del cálculo de tiempos del sexto sprint con la creación de la interfaz gráfica en </w:t>
+      </w:r>
+      <w:proofErr w:type="spellStart"/>
+      <w:r>
+        <w:rPr>
+          <w:sz w:val="28"/>
+          <w:szCs w:val="28"/>
+        </w:rPr>
+        <w:t>Tkinter</w:t>
+      </w:r>
+      <w:proofErr w:type="spellEnd"/>
+      <w:r>
+        <w:rPr>
+          <w:sz w:val="28"/>
+          <w:szCs w:val="28"/>
+        </w:rPr>
+        <w:t>. Añadí el registro de la hora de llegada de cada cliente para calcular las estadísticas y programé un bucle en segundo plano que actualiza los minutos de espera en tiempo real, aplicando además la regla para que el sistema los despache automáticamente a los tres minutos.</w:t>
       </w:r>
     </w:p>
     <w:sectPr>

</xml_diff>

<commit_message>
Test: validar estadisticas de espera y comportamiento en la ventana de la interfaz grafica
</commit_message>
<xml_diff>
--- a/Proyecto-Final.docx
+++ b/Proyecto-Final.docx
@@ -2317,6 +2317,37 @@
           <w:szCs w:val="28"/>
         </w:rPr>
         <w:t>. Añadí el registro de la hora de llegada de cada cliente para calcular las estadísticas y programé un bucle en segundo plano que actualiza los minutos de espera en tiempo real, aplicando además la regla para que el sistema los despache automáticamente a los tres minutos.</w:t>
+      </w:r>
+    </w:p>
+    <w:p>
+      <w:pPr>
+        <w:rPr>
+          <w:sz w:val="28"/>
+          <w:szCs w:val="28"/>
+        </w:rPr>
+      </w:pPr>
+      <w:r>
+        <w:rPr>
+          <w:sz w:val="28"/>
+          <w:szCs w:val="28"/>
+        </w:rPr>
+        <w:t xml:space="preserve">Puse a prueba todo lo del sexto sprint directamente en la aplicación de escritorio. Verifiqué que el sistema controlara correctamente el orden de las filas, que las estadísticas y los minutos en pantalla corrieran de forma fluida sin congelarse, y que el </w:t>
+      </w:r>
+      <w:proofErr w:type="spellStart"/>
+      <w:r>
+        <w:rPr>
+          <w:sz w:val="28"/>
+          <w:szCs w:val="28"/>
+        </w:rPr>
+        <w:t>auto-despacho</w:t>
+      </w:r>
+      <w:proofErr w:type="spellEnd"/>
+      <w:r>
+        <w:rPr>
+          <w:sz w:val="28"/>
+          <w:szCs w:val="28"/>
+        </w:rPr>
+        <w:t xml:space="preserve"> funcionara al pie de la letra al cumplirse el tiempo límite.</w:t>
       </w:r>
     </w:p>
     <w:sectPr>

</xml_diff>

<commit_message>
Docs:Avance del Sprint 7:Registro e Historial de Atendidos
</commit_message>
<xml_diff>
--- a/Proyecto-Final.docx
+++ b/Proyecto-Final.docx
@@ -2349,6 +2349,105 @@
         </w:rPr>
         <w:t xml:space="preserve"> funcionara al pie de la letra al cumplirse el tiempo límite.</w:t>
       </w:r>
+    </w:p>
+    <w:p>
+      <w:pPr>
+        <w:rPr>
+          <w:sz w:val="28"/>
+          <w:szCs w:val="28"/>
+        </w:rPr>
+      </w:pPr>
+    </w:p>
+    <w:p>
+      <w:pPr>
+        <w:rPr>
+          <w:sz w:val="28"/>
+          <w:szCs w:val="28"/>
+        </w:rPr>
+      </w:pPr>
+      <w:r>
+        <w:rPr>
+          <w:sz w:val="28"/>
+          <w:szCs w:val="28"/>
+        </w:rPr>
+        <w:br w:type="page"/>
+      </w:r>
+    </w:p>
+    <w:p>
+      <w:pPr>
+        <w:rPr>
+          <w:sz w:val="28"/>
+          <w:szCs w:val="28"/>
+        </w:rPr>
+      </w:pPr>
+      <w:r>
+        <w:rPr>
+          <w:sz w:val="28"/>
+          <w:szCs w:val="28"/>
+        </w:rPr>
+        <w:lastRenderedPageBreak/>
+        <w:t>E</w:t>
+      </w:r>
+      <w:r>
+        <w:rPr>
+          <w:sz w:val="28"/>
+          <w:szCs w:val="28"/>
+        </w:rPr>
+        <w:t xml:space="preserve">structura de datos </w:t>
+      </w:r>
+    </w:p>
+    <w:p>
+      <w:pPr>
+        <w:rPr>
+          <w:sz w:val="28"/>
+          <w:szCs w:val="28"/>
+        </w:rPr>
+      </w:pPr>
+      <w:r>
+        <w:rPr>
+          <w:sz w:val="28"/>
+          <w:szCs w:val="28"/>
+        </w:rPr>
+        <w:t xml:space="preserve">Avance de la semana </w:t>
+      </w:r>
+      <w:r>
+        <w:rPr>
+          <w:sz w:val="28"/>
+          <w:szCs w:val="28"/>
+        </w:rPr>
+        <w:t>7</w:t>
+      </w:r>
+    </w:p>
+    <w:p>
+      <w:pPr>
+        <w:rPr>
+          <w:sz w:val="28"/>
+          <w:szCs w:val="28"/>
+        </w:rPr>
+      </w:pPr>
+      <w:r>
+        <w:rPr>
+          <w:sz w:val="28"/>
+          <w:szCs w:val="28"/>
+        </w:rPr>
+        <w:t>Durante este avance se realizaron mejoras relacionadas con el cálculo de tiempos de espera incorporado en el Sprint 6. Se revisó la actualización de los minutos mostrados en pantalla y se preparó la estructura necesaria para almacenar los turnos que ya fueron atendidos, sentando las bases para el módulo de historial del Sprint 7.</w:t>
+      </w:r>
+    </w:p>
+    <w:p>
+      <w:pPr>
+        <w:rPr>
+          <w:sz w:val="28"/>
+          <w:szCs w:val="28"/>
+        </w:rPr>
+      </w:pPr>
+    </w:p>
+    <w:p>
+      <w:pPr>
+        <w:rPr>
+          <w:sz w:val="28"/>
+          <w:szCs w:val="28"/>
+        </w:rPr>
+      </w:pPr>
     </w:p>
     <w:sectPr>
       <w:pgSz w:w="12240" w:h="15840"/>
@@ -3540,7 +3639,6 @@
   <w:style w:type="character" w:default="1" w:styleId="Fuentedeprrafopredeter">
     <w:name w:val="Default Paragraph Font"/>
     <w:uiPriority w:val="1"/>
-    <w:semiHidden/>
     <w:unhideWhenUsed/>
   </w:style>
   <w:style w:type="table" w:default="1" w:styleId="Tablanormal">

</xml_diff>

<commit_message>
Docs: planificación del Sprint 7 historial de turnos atendidos
</commit_message>
<xml_diff>
--- a/Proyecto-Final.docx
+++ b/Proyecto-Final.docx
@@ -2408,14 +2408,7 @@
           <w:sz w:val="28"/>
           <w:szCs w:val="28"/>
         </w:rPr>
-        <w:t xml:space="preserve">Avance de la semana </w:t>
-      </w:r>
-      <w:r>
-        <w:rPr>
-          <w:sz w:val="28"/>
-          <w:szCs w:val="28"/>
-        </w:rPr>
-        <w:t>7</w:t>
+        <w:t>Avance de la semana 7</w:t>
       </w:r>
     </w:p>
     <w:p>
@@ -2431,6 +2424,36 @@
           <w:szCs w:val="28"/>
         </w:rPr>
         <w:t>Durante este avance se realizaron mejoras relacionadas con el cálculo de tiempos de espera incorporado en el Sprint 6. Se revisó la actualización de los minutos mostrados en pantalla y se preparó la estructura necesaria para almacenar los turnos que ya fueron atendidos, sentando las bases para el módulo de historial del Sprint 7.</w:t>
+      </w:r>
+    </w:p>
+    <w:p>
+      <w:pPr>
+        <w:rPr>
+          <w:sz w:val="28"/>
+          <w:szCs w:val="28"/>
+        </w:rPr>
+      </w:pPr>
+      <w:r>
+        <w:rPr>
+          <w:sz w:val="28"/>
+          <w:szCs w:val="28"/>
+        </w:rPr>
+        <w:t>Como parte de la planificación del Sprint 7, se definió el desarrollo del módulo de Registro e Historial de Atendidos. El objetivo principal de esta etapa es conservar un registro de todos los turnos que han sido procesados por el sistema durante la jornada de trabajo. Para ello, se contempla la creación de una estructura que permita almacenar la información de los clientes una vez que finaliza su atención.</w:t>
+      </w:r>
+    </w:p>
+    <w:p>
+      <w:pPr>
+        <w:rPr>
+          <w:sz w:val="28"/>
+          <w:szCs w:val="28"/>
+        </w:rPr>
+      </w:pPr>
+      <w:r>
+        <w:rPr>
+          <w:sz w:val="28"/>
+          <w:szCs w:val="28"/>
+        </w:rPr>
+        <w:t>Asimismo, se estableció que el historial deberá conservar datos importantes como el folio del turno, el nombre del cliente, el tipo de trámite realizado y el estado final del servicio. Esta funcionalidad permitirá consultar posteriormente los registros almacenados y servirá como base para futuras mejoras relacionadas con reportes y estadísticas de atención.</w:t>
       </w:r>
     </w:p>
     <w:p>
@@ -3639,6 +3662,7 @@
   <w:style w:type="character" w:default="1" w:styleId="Fuentedeprrafopredeter">
     <w:name w:val="Default Paragraph Font"/>
     <w:uiPriority w:val="1"/>
+    <w:semiHidden/>
     <w:unhideWhenUsed/>
   </w:style>
   <w:style w:type="table" w:default="1" w:styleId="Tablanormal">

</xml_diff>

<commit_message>
Test: validación de diseño y estructura del historial de atención
</commit_message>
<xml_diff>
--- a/Proyecto-Final.docx
+++ b/Proyecto-Final.docx
@@ -2365,6 +2365,94 @@
           <w:szCs w:val="28"/>
         </w:rPr>
       </w:pPr>
+    </w:p>
+    <w:p>
+      <w:pPr>
+        <w:rPr>
+          <w:sz w:val="28"/>
+          <w:szCs w:val="28"/>
+        </w:rPr>
+      </w:pPr>
+    </w:p>
+    <w:p>
+      <w:pPr>
+        <w:rPr>
+          <w:sz w:val="28"/>
+          <w:szCs w:val="28"/>
+        </w:rPr>
+      </w:pPr>
+    </w:p>
+    <w:p>
+      <w:pPr>
+        <w:rPr>
+          <w:sz w:val="28"/>
+          <w:szCs w:val="28"/>
+        </w:rPr>
+      </w:pPr>
+    </w:p>
+    <w:p>
+      <w:pPr>
+        <w:rPr>
+          <w:sz w:val="28"/>
+          <w:szCs w:val="28"/>
+        </w:rPr>
+      </w:pPr>
+    </w:p>
+    <w:p>
+      <w:pPr>
+        <w:rPr>
+          <w:sz w:val="28"/>
+          <w:szCs w:val="28"/>
+        </w:rPr>
+      </w:pPr>
+    </w:p>
+    <w:p>
+      <w:pPr>
+        <w:rPr>
+          <w:sz w:val="28"/>
+          <w:szCs w:val="28"/>
+        </w:rPr>
+      </w:pPr>
+    </w:p>
+    <w:p>
+      <w:pPr>
+        <w:rPr>
+          <w:sz w:val="28"/>
+          <w:szCs w:val="28"/>
+        </w:rPr>
+      </w:pPr>
+    </w:p>
+    <w:p>
+      <w:pPr>
+        <w:rPr>
+          <w:sz w:val="28"/>
+          <w:szCs w:val="28"/>
+        </w:rPr>
+      </w:pPr>
+    </w:p>
+    <w:p>
+      <w:pPr>
+        <w:rPr>
+          <w:sz w:val="28"/>
+          <w:szCs w:val="28"/>
+        </w:rPr>
+      </w:pPr>
+    </w:p>
+    <w:p>
+      <w:pPr>
+        <w:rPr>
+          <w:sz w:val="28"/>
+          <w:szCs w:val="28"/>
+        </w:rPr>
+      </w:pPr>
+    </w:p>
+    <w:p>
+      <w:pPr>
+        <w:rPr>
+          <w:sz w:val="28"/>
+          <w:szCs w:val="28"/>
+        </w:rPr>
+      </w:pPr>
       <w:r>
         <w:rPr>
           <w:sz w:val="28"/>
@@ -2386,14 +2474,7 @@
           <w:szCs w:val="28"/>
         </w:rPr>
         <w:lastRenderedPageBreak/>
-        <w:t>E</w:t>
-      </w:r>
-      <w:r>
-        <w:rPr>
-          <w:sz w:val="28"/>
-          <w:szCs w:val="28"/>
-        </w:rPr>
-        <w:t xml:space="preserve">structura de datos </w:t>
+        <w:t xml:space="preserve">Estructura de datos </w:t>
       </w:r>
     </w:p>
     <w:p>
@@ -2454,6 +2535,52 @@
           <w:szCs w:val="28"/>
         </w:rPr>
         <w:t>Asimismo, se estableció que el historial deberá conservar datos importantes como el folio del turno, el nombre del cliente, el tipo de trámite realizado y el estado final del servicio. Esta funcionalidad permitirá consultar posteriormente los registros almacenados y servirá como base para futuras mejoras relacionadas con reportes y estadísticas de atención.</w:t>
+      </w:r>
+    </w:p>
+    <w:p>
+      <w:pPr>
+        <w:rPr>
+          <w:sz w:val="28"/>
+          <w:szCs w:val="28"/>
+        </w:rPr>
+      </w:pPr>
+      <w:r>
+        <w:rPr>
+          <w:sz w:val="28"/>
+          <w:szCs w:val="28"/>
+        </w:rPr>
+        <w:t xml:space="preserve">Posteriormente se realizó una validación de la propuesta planteada para el historial de atención, verificando que la incorporación de esta nueva funcionalidad sea compatible con los módulos desarrollados en los </w:t>
+      </w:r>
+      <w:proofErr w:type="spellStart"/>
+      <w:r>
+        <w:rPr>
+          <w:sz w:val="28"/>
+          <w:szCs w:val="28"/>
+        </w:rPr>
+        <w:t>sprints</w:t>
+      </w:r>
+      <w:proofErr w:type="spellEnd"/>
+      <w:r>
+        <w:rPr>
+          <w:sz w:val="28"/>
+          <w:szCs w:val="28"/>
+        </w:rPr>
+        <w:t xml:space="preserve"> anteriores. También se revisó la integración con el sistema de colas FIFO, las filas preferenciales y el cálculo de tiempos de espera implementados previamente.</w:t>
+      </w:r>
+    </w:p>
+    <w:p>
+      <w:pPr>
+        <w:rPr>
+          <w:sz w:val="28"/>
+          <w:szCs w:val="28"/>
+        </w:rPr>
+      </w:pPr>
+      <w:r>
+        <w:rPr>
+          <w:sz w:val="28"/>
+          <w:szCs w:val="28"/>
+        </w:rPr>
+        <w:t>Como resultado de esta revisión, se confirmó que la estructura propuesta permitirá almacenar de forma organizada los turnos atendidos sin afectar el funcionamiento actual del sistema. Con ello se deja preparada la base para iniciar la implementación del historial de atención en los siguientes avances del proyecto.</w:t>
       </w:r>
     </w:p>
     <w:p>
@@ -3662,7 +3789,6 @@
   <w:style w:type="character" w:default="1" w:styleId="Fuentedeprrafopredeter">
     <w:name w:val="Default Paragraph Font"/>
     <w:uiPriority w:val="1"/>
-    <w:semiHidden/>
     <w:unhideWhenUsed/>
   </w:style>
   <w:style w:type="table" w:default="1" w:styleId="Tablanormal">

</xml_diff>